<commit_message>
Expand Ch 24-27 quick guides, remove column boxes, split Ch 23 into main and index
- Rewrite the Ch 24-27 quick guides to the depth of Ch 23 (about 2 pages each;
  the reading copy is 10 pages)
- Drop the paragraph borders on guide text, which drew a box around each column
- Read equation text and AlternateContent text boxes from the decks, and whole
  multi-line slide titles
- Let the builder run on Linux with Liberation Sans Narrow as Arial Narrow's
  metric twin; fix the how-to box border's position in the style XML
- Rebuild Ch 23 as main + index (20 pages at 12.25 pt)

Co-Authored-By: Claude Opus 5.5 <noreply@anthropic.com>
Claude-Session: https://claude.ai/code/session_01UCsH9gqSSaKQv3czcDCA1B
</commit_message>
<xml_diff>
--- a/Printed Exam Notes/Unit 2 Quick Guides.docx
+++ b/Printed Exam Notes/Unit 2 Quick Guides.docx
@@ -789,7 +789,7 @@
       </w:pPr>
       <w:r>
         <w:rPr/>
-        <w:t>Ch 24 is the anatomy of a flowering plant, built up from cells to tissues to organs. A tissue is a group of specialized cells doing one job; an organ, such as a root, stem or leaf, is made of several tissues (24.1.4).</w:t>
+        <w:t>Ch 24 is the anatomy of a flowering plant, built up from cells to tissues to organs. As in animals, a cell is the basic unit of life; a tissue is a group of specialized cells doing one job; an organ, such as a root, stem or leaf, is made of several tissues (24.1.4).</w:t>
       </w:r>
     </w:p>
     <w:p>
@@ -798,7 +798,7 @@
       </w:pPr>
       <w:r>
         <w:rPr/>
-        <w:t>Everything grows from meristems, zones of cells that keep dividing for the plant's whole life (24.1.6). The new cells become three tissue types: epidermal (the outer covering), ground (the filler that photosynthesizes, stores and supports) and vascular (the plumbing: xylem and phloem) (24.1.3, 24.1.7, 24.1.10, 24.1.13). Those tissues build the vegetative organs: roots, stems and leaves (24.2.18).</w:t>
+        <w:t>Everything grows from meristems: undifferentiated cells that keep dividing for the plant's whole life. Each division leaves one meristem cell and one cell that goes on to specialize (24.1.5, 24.1.6). The new cells become three tissue types: epidermal tissue (the outer covering), ground tissue (the filler that photosynthesizes, stores and supports) and vascular tissue (the plumbing: xylem and phloem) (24.1.3, 24.1.6). These tissues build the three vegetative organs: roots, stems and leaves (24.2.18).</w:t>
       </w:r>
     </w:p>
     <w:p>
@@ -807,7 +807,7 @@
       </w:pPr>
       <w:r>
         <w:rPr/>
-        <w:t>This chapter is very term-heavy. Understand the ideas here, and look up the names in the tables.</w:t>
+        <w:t>Two kinds of growth run through the chapter. Primary growth, from apical meristems at the tips, makes roots and stems longer; secondary growth, from lateral meristems, makes woody stems thicker (24.1.6, 24.4.41, 24.4.42). The chapter is very term-heavy: understand the ideas here, and look up the names in the tables.</w:t>
       </w:r>
     </w:p>
     <w:p>
@@ -833,7 +833,7 @@
       </w:pPr>
       <w:r>
         <w:rPr/>
-        <w:t>Apical meristems at the tips of roots and shoots make the plant longer. Their cells form three primary meristems: protoderm (becomes the epidermis), ground meristem (ground tissue) and procambium (vascular tissue) (24.1.3, 24.1.6).</w:t>
+        <w:t>Apical meristems at the tips of stems and roots make them longer. They produce three primary meristems, each of which makes one tissue type: protoderm makes epidermal tissue, ground meristem makes ground tissue, and procambium makes vascular tissue (24.1.3, 24.1.6).</w:t>
       </w:r>
     </w:p>
     <w:p>
@@ -842,7 +842,7 @@
       </w:pPr>
       <w:r>
         <w:rPr/>
-        <w:t>Epidermal tissue</w:t>
+        <w:t>Epidermal tissue: the protective skin</w:t>
       </w:r>
     </w:p>
     <w:p>
@@ -855,7 +855,7 @@
       </w:pPr>
       <w:r>
         <w:rPr/>
-        <w:t>The outer protective covering: closely packed cells, covered by a waxy cuticle where they face the air (24.1.7).</w:t>
+        <w:t>Closely packed epidermal cells; where they face the air they're covered by a waxy cuticle, which limits water loss (24.1.7).</w:t>
       </w:r>
     </w:p>
     <w:p>
@@ -868,7 +868,7 @@
       </w:pPr>
       <w:r>
         <w:rPr/>
-        <w:t>Root epidermal cells have root hairs, which add surface for taking up water (24.1.7).</w:t>
+        <w:t>Root epidermal cells grow root hairs, which increase the root's surface area for absorbing water (24.1.7).</w:t>
       </w:r>
     </w:p>
     <w:p>
@@ -881,7 +881,7 @@
       </w:pPr>
       <w:r>
         <w:rPr/>
-        <w:t>Trichomes (hairs) on stems and leaves protect from sun and moisture loss and discourage plant-eaters (24.1.8).</w:t>
+        <w:t>Epidermal cells of stems, leaves and reproductive organs grow trichomes (hairs), which protect from sun and moisture loss and discourage herbivory (being eaten) (24.1.8).</w:t>
       </w:r>
     </w:p>
     <w:p>
@@ -894,16 +894,7 @@
       </w:pPr>
       <w:r>
         <w:rPr/>
-        <w:t>The lower leaf surface has stomata. In older woody plants the epidermis is replaced by periderm (cork) (24.1.8).</w:t>
-      </w:r>
-    </w:p>
-    <w:p>
-      <w:pPr>
-        <w:pStyle w:val="Guidesubheading"/>
-      </w:pPr>
-      <w:r>
-        <w:rPr/>
-        <w:t>Ground tissue</w:t>
+        <w:t>The lower leaf surface has stomata: pores, each between two guard cells, for gas exchange (24.1.8, 24.1.9).</w:t>
       </w:r>
     </w:p>
     <w:p>
@@ -916,7 +907,16 @@
       </w:pPr>
       <w:r>
         <w:rPr/>
-        <w:t>Parenchyma: the least specialized and most abundant cells; they can divide, and some contain chloroplasts and photosynthesize (24.1.10).</w:t>
+        <w:t>In older woody stems the epidermis is replaced by periderm, mainly cork, made by the cork cambium (24.1.8). Cork cells contain waterproof suberin, so gases pass only at lenticels, loose spots in the cork (24.4.44).</w:t>
+      </w:r>
+    </w:p>
+    <w:p>
+      <w:pPr>
+        <w:pStyle w:val="Guidesubheading"/>
+      </w:pPr>
+      <w:r>
+        <w:rPr/>
+        <w:t>Ground tissue: the bulk of the plant</w:t>
       </w:r>
     </w:p>
     <w:p>
@@ -929,7 +929,7 @@
       </w:pPr>
       <w:r>
         <w:rPr/>
-        <w:t>Collenchyma: thicker walls; flexible support for young stems (the strings in celery) (24.1.10).</w:t>
+        <w:t>Parenchyma: the least specialized and most abundant cells, found in every organ. They can divide and give rise to more specialized cells, and those with chloroplasts photosynthesize (24.1.10).</w:t>
       </w:r>
     </w:p>
     <w:p>
@@ -942,16 +942,7 @@
       </w:pPr>
       <w:r>
         <w:rPr/>
-        <w:t>Sclerenchyma: thick walls with lignin, mostly dead at maturity; rigid support. Fibers are long (hemp, rope); sclereids are short (nutshells, seed coats) (24.1.11).</w:t>
-      </w:r>
-    </w:p>
-    <w:p>
-      <w:pPr>
-        <w:pStyle w:val="Guidesubheading"/>
-      </w:pPr>
-      <w:r>
-        <w:rPr/>
-        <w:t>Vascular tissue</w:t>
+        <w:t>Collenchyma: living cells with thicker primary walls, in bundles under the epidermis; flexible support for young regions, like the strings in celery stalks (24.1.10).</w:t>
       </w:r>
     </w:p>
     <w:p>
@@ -964,7 +955,16 @@
       </w:pPr>
       <w:r>
         <w:rPr/>
-        <w:t>Xylem carries water and minerals up. Its conducting cells are tracheids (long, tapered, water passes through pits) and vessel elements (larger, with perforation plates, joined end to end into open pipes) (24.1.13, 24.1.15).</w:t>
+        <w:t>Sclerenchyma: thick secondary walls hardened with lignin; most are dead at maturity; they support mature regions. Fibers are long and slender (hemp, rope); sclereids are shorter and varied (seed coats, nutshells) (24.1.11).</w:t>
+      </w:r>
+    </w:p>
+    <w:p>
+      <w:pPr>
+        <w:pStyle w:val="Guidesubheading"/>
+      </w:pPr>
+      <w:r>
+        <w:rPr/>
+        <w:t>Vascular tissue: the plumbing</w:t>
       </w:r>
     </w:p>
     <w:p>
@@ -977,7 +977,7 @@
       </w:pPr>
       <w:r>
         <w:rPr/>
-        <w:t>Phloem carries sugar. Its conducting cells, sieve-tube members, have cytoplasm but no nucleus and connect through sieve plates; each has a companion cell, with a nucleus, that supports it (24.1.16).</w:t>
+        <w:t>Xylem carries water and minerals from the roots to the leaves. Its two water-conducting cells are tracheids, long with tapered ends, where water crosses through pits in the walls, and vessel elements, larger, with perforation plates in their end walls, lined up into a continuous vessel (24.1.13, 24.1.15). Both are dead and hollow when they work (textbook).</w:t>
       </w:r>
     </w:p>
     <w:p>
@@ -990,60 +990,7 @@
       </w:pPr>
       <w:r>
         <w:rPr/>
-        <w:t>Where they are: the vascular cylinder in roots, vascular bundles in stems, veins in leaves (24.1.13).</w:t>
-      </w:r>
-    </w:p>
-    <w:p>
-      <w:pPr>
-        <w:pStyle w:val="Guidetext"/>
-      </w:pPr>
-      <w:r>
-        <w:rPr/>
-        <w:t>Traps: tracheids vs vessel elements (both xylem); sieve-tube member (no nucleus) vs companion cell; collenchyma (flexible, living) vs sclerenchyma (rigid, mostly dead) (24.1.10, 24.1.11, 24.1.15, 24.1.16).</w:t>
-      </w:r>
-    </w:p>
-    <w:p>
-      <w:pPr>
-        <w:pStyle w:val="Guidepart"/>
-      </w:pPr>
-      <w:bookmarkStart w:id="10" w:name="g242"/>
-      <w:r>
-        <w:rPr>
-          <w:rStyle w:val="Slidecode"/>
-        </w:rPr>
-        <w:t>24.2 Organs of Flowering Plants</w:t>
-      </w:r>
-      <w:r>
-        <w:rPr/>
-        <w:t xml:space="preserve"> (slides 18–25)</w:t>
-      </w:r>
-      <w:bookmarkEnd w:id="10"/>
-    </w:p>
-    <w:p>
-      <w:pPr>
-        <w:pStyle w:val="Guidetext"/>
-      </w:pPr>
-      <w:r>
-        <w:rPr/>
-        <w:t>The vegetative organs are all the plant parts except the reproductive ones: roots, stems and leaves. Most flowering plants have a root system below ground and a shoot system above (24.2.18).</w:t>
-      </w:r>
-    </w:p>
-    <w:p>
-      <w:pPr>
-        <w:pStyle w:val="Guidetext"/>
-      </w:pPr>
-      <w:r>
-        <w:rPr/>
-        <w:t>The shoot system is the stem, branches and leaves. Nodes are where leaves attach to the stem; internodes are the stretches of stem between nodes (24.2.20). A terminal bud sits at the stem tip, and axillary buds sit where leaves meet the stem (24.2.21, 24.4.35).</w:t>
-      </w:r>
-    </w:p>
-    <w:p>
-      <w:pPr>
-        <w:pStyle w:val="Guidesubheading"/>
-      </w:pPr>
-      <w:r>
-        <w:rPr/>
-        <w:t>Monocots vs eudicots</w:t>
+        <w:t>Vascular rays between rows of tracheids carry water sideways, across the width of the plant (24.1.15).</w:t>
       </w:r>
     </w:p>
     <w:p>
@@ -1056,7 +1003,7 @@
       </w:pPr>
       <w:r>
         <w:rPr/>
-        <w:t>Monocots: one cotyledon, which transfers nutrients from the endosperm; parallel leaf veins; flower parts in threes; root vascular tissue in a ring (24.2.22).</w:t>
+        <w:t>Phloem carries sucrose and other organic compounds. Its conducting cells, sieve-tube members, have cytoplasm but no nucleus, and their walls have sieve plates (clusters of pores). Each has a companion cell, which has a nucleus and helps with transport; plasmodesmata (channels between plant cells) connect the two (24.1.16).</w:t>
       </w:r>
     </w:p>
     <w:p>
@@ -1069,7 +1016,7 @@
       </w:pPr>
       <w:r>
         <w:rPr/>
-        <w:t>Eudicots: two cotyledons, which supply the seedling's nutrients; netted leaf veins; flower parts in fours or fives; root phloem between the arms of the xylem (24.2.23).</w:t>
+        <w:t>Where it is: the vascular cylinder in roots, vascular bundles in stems, leaf veins in leaves (24.1.13).</w:t>
       </w:r>
     </w:p>
     <w:p>
@@ -1078,25 +1025,25 @@
       </w:pPr>
       <w:r>
         <w:rPr/>
-        <w:t>Annual plants live one growing season: they make flowers and seeds, then die. Perennial plants live three or more seasons. The flower-inducing genes LEAFY and Apetala 1 act as the switch: blocking them in an annual makes it grow like a perennial (24.2.25).</w:t>
+        <w:t>Traps: tracheid vs vessel element (both xylem, both carry water); sieve-tube member (no nucleus) vs companion cell (nucleus); collenchyma (living, flexible) vs sclerenchyma (mostly dead, rigid, lignin); fibers (long) vs sclereids (short) (24.1.10, 24.1.11, 24.1.15, 24.1.16).</w:t>
       </w:r>
     </w:p>
     <w:p>
       <w:pPr>
         <w:pStyle w:val="Guidepart"/>
       </w:pPr>
-      <w:bookmarkStart w:id="11" w:name="g243"/>
+      <w:bookmarkStart w:id="10" w:name="g242"/>
       <w:r>
         <w:rPr>
           <w:rStyle w:val="Slidecode"/>
         </w:rPr>
-        <w:t>24.3 Organization and Diversity of Roots</w:t>
-      </w:r>
-      <w:r>
-        <w:rPr/>
-        <w:t xml:space="preserve"> (slides 26–34)</w:t>
-      </w:r>
-      <w:bookmarkEnd w:id="11"/>
+        <w:t>24.2 Organs of Flowering Plants</w:t>
+      </w:r>
+      <w:r>
+        <w:rPr/>
+        <w:t xml:space="preserve"> (slides 18–25)</w:t>
+      </w:r>
+      <w:bookmarkEnd w:id="10"/>
     </w:p>
     <w:p>
       <w:pPr>
@@ -1104,7 +1051,16 @@
       </w:pPr>
       <w:r>
         <w:rPr/>
-        <w:t>Root zones, from the tip up (24.3.26): the root cap protects the root apical meristem; then come the zone of cell division, the zone of elongation (cells lengthen and start to specialize) and the zone of maturation (fully differentiated cells, with root hairs).</w:t>
+        <w:t>Vegetative organs are all the plant parts except the reproductive structures (flowers, seeds and fruits); they handle growth and nutrition. There are three: roots, stems and leaves (24.2.18). Most flowering plants have a root system, which is just the roots, and a shoot system, the stem and leaves (24.2.18, 24.2.19).</w:t>
+      </w:r>
+    </w:p>
+    <w:p>
+      <w:pPr>
+        <w:pStyle w:val="Guidetext"/>
+      </w:pPr>
+      <w:r>
+        <w:rPr/>
+        <w:t>The stem is the main axis; it grows longer and produces leaves. Nodes are where leaves attach; internodes are the stretches of stem between nodes. The terminal bud at the stem's end contains the shoot apical meristem and produces new leaves (24.2.20, 24.2.21). Lateral (axillary) buds sit where a leaf joins the stem and can grow into branches (24.2.19, 24.2.21).</w:t>
       </w:r>
     </w:p>
     <w:p>
@@ -1113,7 +1069,7 @@
       </w:pPr>
       <w:r>
         <w:rPr/>
-        <w:t>Root tissues, from the outside in</w:t>
+        <w:t>Monocots vs eudicots (24.2.22 to 24.2.24)</w:t>
       </w:r>
     </w:p>
     <w:p>
@@ -1126,7 +1082,7 @@
       </w:pPr>
       <w:r>
         <w:rPr/>
-        <w:t>Epidermis: the outer layer (24.3.27).</w:t>
+        <w:t>Cotyledons (seed leaves): monocots have one, which acts as transfer tissue, passing on nutrients from the endosperm; eudicots have two, which supply the seedling's nutrients themselves (24.2.22, 24.2.23).</w:t>
       </w:r>
     </w:p>
     <w:p>
@@ -1139,7 +1095,7 @@
       </w:pPr>
       <w:r>
         <w:rPr/>
-        <w:t>Cortex: parenchyma cells that water and minerals move through (24.3.27).</w:t>
+        <w:t>Roots: monocot vascular tissue is in a ring; in eudicots the phloem sits between the arms of the xylem (24.2.22, 24.2.23).</w:t>
       </w:r>
     </w:p>
     <w:p>
@@ -1152,7 +1108,7 @@
       </w:pPr>
       <w:r>
         <w:rPr/>
-        <w:t>Endodermis: the boundary around the vascular cylinder. Its Casparian strip is waterproof, so water and minerals must pass through the endodermal cells themselves (24.3.27).</w:t>
+        <w:t>Stems: monocot vascular bundles are scattered; eudicot bundles are in a distinct ring (24.2.24).</w:t>
       </w:r>
     </w:p>
     <w:p>
@@ -1165,7 +1121,7 @@
       </w:pPr>
       <w:r>
         <w:rPr/>
-        <w:t>Pericycle: dividing cells where branch (lateral) roots start (24.3.27).</w:t>
+        <w:t>Leaves: monocots have parallel veins; eudicots have netted veins (24.2.22, 24.2.23).</w:t>
       </w:r>
     </w:p>
     <w:p>
@@ -1178,7 +1134,7 @@
       </w:pPr>
       <w:r>
         <w:rPr/>
-        <w:t>The vascular cylinder in the center (24.3.27, 24.3.28).</w:t>
+        <w:t>Flowers: monocot parts in threes; eudicot parts in fours or fives. Pollen: monocots have one pore or slit, eudicots three (24.2.24).</w:t>
       </w:r>
     </w:p>
     <w:p>
@@ -1187,7 +1143,7 @@
       </w:pPr>
       <w:r>
         <w:rPr/>
-        <w:t>Monocot roots have the same growth zones, but pith in the center surrounded by a ring of vascular tissue, and they don't undergo secondary growth (24.3.30).</w:t>
+        <w:t>Annual plants live one growing season: they make just enough vegetative structures to support flowers and seeds, and die after the seeds are dispersed. Perennial plants live three or more seasons and spend energy on vegetative structures that let them survive for years (24.2.25).</w:t>
       </w:r>
     </w:p>
     <w:p>
@@ -1196,34 +1152,25 @@
       </w:pPr>
       <w:r>
         <w:rPr/>
-        <w:t>Root types (24.3.32): a taproot is one long, fleshy main root that grows straight down and stores food; a fibrous root system is many slender roots that anchor the plant (found in monocots). Some roots are specialized: storage roots, prop roots, pneumatophores that let swamp roots get oxygen, and aerial roots (24.3.32, 24.3.33).</w:t>
-      </w:r>
-    </w:p>
-    <w:p>
-      <w:pPr>
-        <w:pStyle w:val="Guidetext"/>
-      </w:pPr>
-      <w:r>
-        <w:rPr/>
-        <w:t>Root partners (24.3.34): mycorrhizae are fungi that live with roots and help them extract water and minerals; root nodules contain nitrogen-fixing bacteria, because plants can't take nitrogen from the air themselves.</w:t>
+        <w:t>The switch between the two is a pair of flower-inducing genes, LEAFY and Apetala 1: when they turn on, the shoot apical meristem stops making leaves and starts making flowers (textbook). Blocking these genes in an annual makes it grow like a perennial (24.2.25).</w:t>
       </w:r>
     </w:p>
     <w:p>
       <w:pPr>
         <w:pStyle w:val="Guidepart"/>
       </w:pPr>
-      <w:bookmarkStart w:id="12" w:name="g244"/>
+      <w:bookmarkStart w:id="11" w:name="g243"/>
       <w:r>
         <w:rPr>
           <w:rStyle w:val="Slidecode"/>
         </w:rPr>
-        <w:t>24.4 Organization and Diversity of Stems</w:t>
-      </w:r>
-      <w:r>
-        <w:rPr/>
-        <w:t xml:space="preserve"> (slides 35–49)</w:t>
-      </w:r>
-      <w:bookmarkEnd w:id="12"/>
+        <w:t>24.3 Organization and Diversity of Roots</w:t>
+      </w:r>
+      <w:r>
+        <w:rPr/>
+        <w:t xml:space="preserve"> (slides 26–34)</w:t>
+      </w:r>
+      <w:bookmarkEnd w:id="11"/>
     </w:p>
     <w:p>
       <w:pPr>
@@ -1231,117 +1178,17 @@
       </w:pPr>
       <w:r>
         <w:rPr/>
-        <w:t>A woody twig (24.4.35, 24.4.36): the terminal bud at the tip is protected by bud scales. Each spring the scales drop and leave a scar, so each ring of scars is one year of growth. Leaves attach at nodes, with axillary buds above them.</w:t>
-      </w:r>
-    </w:p>
-    <w:p>
-      <w:pPr>
-        <w:pStyle w:val="Guidetext"/>
-      </w:pPr>
-      <w:r>
-        <w:rPr/>
-        <w:t>Herbaceous (non-woody) stems have only primary growth and are covered with a waxy cuticle. Their vascular bundles are in a ring in eudicots and scattered in monocots (24.4.38, 24.4.39, 24.4.40).</w:t>
-      </w:r>
-    </w:p>
-    <w:p>
-      <w:pPr>
-        <w:pStyle w:val="Guidetext"/>
-      </w:pPr>
-      <w:r>
-        <w:rPr/>
-        <w:t>Woody stems also have secondary growth, which makes them thicker; secondary tissues come from lateral meristems each year (24.4.41, 24.4.42). A woody stem has three regions: bark, wood and pith (24.4.42). The slide's "woody stems have no vascular tissue" is wrong: wood is secondary xylem, and bark contains phloem (24.4.44, 24.4.45).</w:t>
-      </w:r>
-    </w:p>
-    <w:p>
-      <w:pPr>
-        <w:pStyle w:val="Guidetext"/>
-      </w:pPr>
-      <w:r>
-        <w:rPr/>
-        <w:t>Bark contains cork, cork cambium, cortex and phloem. Girdling (removing a ring of bark all the way around) kills a tree, because the phloem in the bark can no longer carry organic nutrients (24.4.44).</w:t>
-      </w:r>
-    </w:p>
-    <w:p>
-      <w:pPr>
-        <w:pStyle w:val="Guidetext"/>
-      </w:pPr>
-      <w:r>
-        <w:rPr/>
-        <w:t>Wood is secondary xylem that builds up year after year. One annual ring is spring wood plus summer wood; summer wood has fewer vessels. In older trees the inner rings, the heartwood, no longer carry water (24.4.45, 24.4.47).</w:t>
-      </w:r>
-    </w:p>
-    <w:p>
-      <w:pPr>
-        <w:pStyle w:val="Guidetext"/>
-      </w:pPr>
-      <w:r>
-        <w:rPr/>
-        <w:t>Stem types (24.4.48, 24.4.49): stolons are above-ground horizontal stems that make new plants where nodes touch the ground; rhizomes are underground horizontal stems; tubers (potato) are enlarged storage stems; corms are underground stems that make new plants the next season. Uses: sugar cane gives table sugar, bark gives cinnamon and quinine, and wood gives paper and building materials (24.4.48).</w:t>
-      </w:r>
-    </w:p>
-    <w:p>
-      <w:pPr>
-        <w:pStyle w:val="Guidepart"/>
-      </w:pPr>
-      <w:bookmarkStart w:id="13" w:name="g245"/>
-      <w:r>
-        <w:rPr>
-          <w:rStyle w:val="Slidecode"/>
-        </w:rPr>
-        <w:t>24.5 Organization and Diversity of Leaves</w:t>
-      </w:r>
-      <w:r>
-        <w:rPr/>
-        <w:t xml:space="preserve"> (slides 50–55)</w:t>
-      </w:r>
-      <w:bookmarkEnd w:id="13"/>
-    </w:p>
-    <w:p>
-      <w:pPr>
-        <w:pStyle w:val="Guidetext"/>
-      </w:pPr>
-      <w:r>
-        <w:rPr/>
-        <w:t>The leaf is the main organ of photosynthesis, which needs water, carbon dioxide and sunlight (24.5.50). A foliage leaf has a wide blade on a stalk called the petiole (24.5.50).</w:t>
-      </w:r>
-    </w:p>
-    <w:p>
-      <w:pPr>
-        <w:pStyle w:val="Guidetext"/>
-      </w:pPr>
-      <w:r>
-        <w:rPr/>
-        <w:t>Inside a leaf (24.5.51, 24.5.52): upper and lower epidermis with a waxy cuticle and trichomes, stomata in the lower epidermis for gas exchange, and the mesophyll in between. In eudicots the mesophyll is palisade mesophyll (elongated cells near the top) over spongy mesophyll (irregular cells with air spaces). Leaf veins carry the xylem and phloem.</w:t>
-      </w:r>
-    </w:p>
-    <w:p>
-      <w:pPr>
-        <w:pStyle w:val="Guidetext"/>
-      </w:pPr>
-      <w:r>
-        <w:rPr/>
-        <w:t>Leaves vary (24.5.53, 24.5.54): they can be arranged alternate, opposite or whorled on the stem; the blade can be simple or compound; and they adapt to their environment, as shade leaves, spines, climbing tendrils or insect-catching leaves (24.5.53, 24.5.55).</w:t>
-      </w:r>
-    </w:p>
-    <w:p>
-      <w:pPr>
-        <w:pStyle w:val="Guidetext"/>
-      </w:pPr>
-      <w:r>
-        <w:rPr/>
-        <w:t>Traps: stolon vs rhizome; palisade vs spongy mesophyll; simple vs compound leaves; taproot vs fibrous roots (24.3.32, 24.4.48, 24.5.51, 24.5.53).</w:t>
-      </w:r>
-    </w:p>
-    <w:p>
-      <w:pPr>
-        <w:pStyle w:val="Guidepart"/>
-      </w:pPr>
-      <w:bookmarkStart w:id="14" w:name="g249"/>
-      <w:r>
-        <w:rPr/>
-        <w:t>Look these up, don't memorize</w:t>
-      </w:r>
-      <w:bookmarkEnd w:id="14"/>
+        <w:t>Root zones, from the tip up (24.3.26, 24.3.28): the root cap covers and protects the root apical meristem; in the zone of cell division the primary meristems divide; in the zone of elongation cells lengthen and begin to specialize; in the zone of maturation cells are fully differentiated, and root hairs grow there.</w:t>
+      </w:r>
+    </w:p>
+    <w:p>
+      <w:pPr>
+        <w:pStyle w:val="Guidesubheading"/>
+      </w:pPr>
+      <w:r>
+        <w:rPr/>
+        <w:t>Eudicot root tissues, from the outside in</w:t>
+      </w:r>
     </w:p>
     <w:p>
       <w:pPr>
@@ -1353,7 +1200,7 @@
       </w:pPr>
       <w:r>
         <w:rPr/>
-        <w:t>Which tissue does which job: the ground-tissue and vascular-tissue tables.</w:t>
+        <w:t>Epidermis: the outer layer of the root, with the root hairs (24.3.27, 24.3.28).</w:t>
       </w:r>
     </w:p>
     <w:p>
@@ -1366,7 +1213,7 @@
       </w:pPr>
       <w:r>
         <w:rPr/>
-        <w:t>Root zones and root tissues in order: the root tables.</w:t>
+        <w:t>Cortex: parenchyma cells; water and minerals move between and through them (24.3.27). It mainly stores food (textbook).</w:t>
       </w:r>
     </w:p>
     <w:p>
@@ -1379,7 +1226,7 @@
       </w:pPr>
       <w:r>
         <w:rPr/>
-        <w:t>Stem types, leaf types and leaf adaptations: the stem and leaf tables.</w:t>
+        <w:t>Endodermis: one layer of cells forming the boundary between the cortex and the vascular cylinder. Its Casparian strip, made of lignin and suberin, is a waterproof band, so water and minerals can't slip between the cells and must pass through the endodermal cells, which control what enters (24.3.27, 24.3.28). The slide says "protein lignin" (so does the textbook), but lignin isn't a protein.</w:t>
       </w:r>
     </w:p>
     <w:p>
@@ -1392,93 +1239,7 @@
       </w:pPr>
       <w:r>
         <w:rPr/>
-        <w:t>Monocot vs eudicot details: the comparison table and 24.2.22, 24.2.23.</w:t>
-      </w:r>
-    </w:p>
-    <w:p>
-      <w:pPr>
-        <w:pStyle w:val="Chapterheading"/>
-      </w:pPr>
-      <w:r>
-        <w:rPr>
-          <w:rStyle w:val="Slidecode"/>
-        </w:rPr>
-        <w:t>Chapter 25: Flowering Plants: Nutrition and Transport</w:t>
-      </w:r>
-    </w:p>
-    <w:p>
-      <w:pPr>
-        <w:pStyle w:val="Guideheading"/>
-      </w:pPr>
-      <w:bookmarkStart w:id="15" w:name="g250"/>
-      <w:r>
-        <w:rPr>
-          <w:rStyle w:val="Slidecode"/>
-        </w:rPr>
-        <w:t>Quick guide: the big picture</w:t>
-      </w:r>
-      <w:bookmarkEnd w:id="15"/>
-    </w:p>
-    <w:p>
-      <w:pPr>
-        <w:pStyle w:val="Guidetext"/>
-      </w:pPr>
-      <w:r>
-        <w:rPr/>
-        <w:t>Ch 25 is about how a plant feeds itself. It builds most of its body from carbon dioxide and water, takes other elements from the soil as minerals, pulls water up through the xylem, and pushes sugar through the phloem to wherever it's needed (25.1.3, 25.2.19, 25.3.28, 25.3.29).</w:t>
-      </w:r>
-    </w:p>
-    <w:p>
-      <w:pPr>
-        <w:pStyle w:val="Guidepart"/>
-      </w:pPr>
-      <w:bookmarkStart w:id="16" w:name="g251"/>
-      <w:r>
-        <w:rPr>
-          <w:rStyle w:val="Slidecode"/>
-        </w:rPr>
-        <w:t>25.1 Plant Nutrition and Soil</w:t>
-      </w:r>
-      <w:r>
-        <w:rPr/>
-        <w:t xml:space="preserve"> (slides 3–18)</w:t>
-      </w:r>
-      <w:bookmarkEnd w:id="16"/>
-    </w:p>
-    <w:p>
-      <w:pPr>
-        <w:pStyle w:val="Guidetext"/>
-      </w:pPr>
-      <w:r>
-        <w:rPr/>
-        <w:t>About 95% of a plant's dry weight is carbon, hydrogen and oxygen, which come from carbon dioxide and water (25.1.3). Everything else enters through the roots as minerals.</w:t>
-      </w:r>
-    </w:p>
-    <w:p>
-      <w:pPr>
-        <w:pStyle w:val="Guidetext"/>
-      </w:pPr>
-      <w:r>
-        <w:rPr/>
-        <w:t>A nutrient is essential if it has an identifiable role, no other nutrient can substitute for it, and a deficiency causes the plant to die (25.1.4). Macronutrients are needed in large amounts; micronutrients in small amounts (25.1.4). The slide's macronutrient list leaves out nitrogen; the textbook includes it.</w:t>
-      </w:r>
-    </w:p>
-    <w:p>
-      <w:pPr>
-        <w:pStyle w:val="Guidetext"/>
-      </w:pPr>
-      <w:r>
-        <w:rPr/>
-        <w:t>Hydroponics (growing plants in water with dissolved nutrients) showed which nutrients are essential: omit one and the plant grows poorly (25.1.6, 25.1.7). Fertilizer's three numbers, NPK, give its nitrogen, phosphorus and potassium (25.1.6, 25.1.8).</w:t>
-      </w:r>
-    </w:p>
-    <w:p>
-      <w:pPr>
-        <w:pStyle w:val="Guidesubheading"/>
-      </w:pPr>
-      <w:r>
-        <w:rPr/>
-        <w:t>Soil</w:t>
+        <w:t>Pericycle: just inside the endodermis; its cells keep dividing and start branch (lateral) roots, which grow out through the cortex (24.3.27, 24.3.29).</w:t>
       </w:r>
     </w:p>
     <w:p>
@@ -1491,7 +1252,34 @@
       </w:pPr>
       <w:r>
         <w:rPr/>
-        <w:t>Soil is mineral particles, decaying organic material, living organisms, air and water. It forms by weathering of rock, which can be mechanical (wind, rain, ice) or chemical (25.1.9).</w:t>
+        <w:t>Vascular cylinder: in eudicots, star-shaped xylem with phloem between its arms (24.2.23, 24.3.28).</w:t>
+      </w:r>
+    </w:p>
+    <w:p>
+      <w:pPr>
+        <w:pStyle w:val="Guidetext"/>
+      </w:pPr>
+      <w:r>
+        <w:rPr/>
+        <w:t>Monocot roots have the same growth zones and the same layers (pericycle, endodermis, cortex, epidermis), but a central pith surrounded by a ring of vascular tissue, and they don't undergo secondary growth (24.3.30, 24.3.31). (One textbook sentence says they do, but the textbook also says secondary growth occurs only in conifers and woody eudicots, which agrees with the slide.)</w:t>
+      </w:r>
+    </w:p>
+    <w:p>
+      <w:pPr>
+        <w:pStyle w:val="Guidetext"/>
+      </w:pPr>
+      <w:r>
+        <w:rPr/>
+        <w:t>Root types (24.3.32): a taproot is one long, fleshy main root that grows straight down and stores food (eudicots; textbook); a fibrous root system is many slender roots and lateral branches that anchor the plant (monocots).</w:t>
+      </w:r>
+    </w:p>
+    <w:p>
+      <w:pPr>
+        <w:pStyle w:val="Guidesubheading"/>
+      </w:pPr>
+      <w:r>
+        <w:rPr/>
+        <w:t>Root specializations (24.3.32, 24.3.33; examples from the textbook)</w:t>
       </w:r>
     </w:p>
     <w:p>
@@ -1504,7 +1292,7 @@
       </w:pPr>
       <w:r>
         <w:rPr/>
-        <w:t>Its particles are sand (largest; water drains fast), silt and clay (smallest) (25.1.10).</w:t>
+        <w:t>Storage roots store large amounts of carbohydrate (sweet potato) (24.3.32, 24.3.33).</w:t>
       </w:r>
     </w:p>
     <w:p>
@@ -1517,7 +1305,7 @@
       </w:pPr>
       <w:r>
         <w:rPr/>
-        <w:t>Humus (decaying organic matter) decreases runoff, prevents leaching and holds positively charged minerals (25.1.11).</w:t>
+        <w:t>Prop roots grow from the base of the stem for support in high wind (corn) (24.3.32, 24.3.33).</w:t>
       </w:r>
     </w:p>
     <w:p>
@@ -1530,7 +1318,7 @@
       </w:pPr>
       <w:r>
         <w:rPr/>
-        <w:t>Cation exchange: negatively charged clay and humus hold positive minerals such as calcium and potassium. Hydrogen ions from the root swap places with them, so the root can take them up (25.1.12).</w:t>
+        <w:t>Pneumatophores grow up out of the water so the roots can get oxygen (mangrove, bald cypress) (24.3.33).</w:t>
       </w:r>
     </w:p>
     <w:p>
@@ -1543,7 +1331,7 @@
       </w:pPr>
       <w:r>
         <w:rPr/>
-        <w:t>Soil profile: the A horizon (topsoil, with litter and humus), the B horizon (subsoil, with inorganic nutrients) and the C horizon (weathered parent material) (25.1.15, 25.1.16).</w:t>
+        <w:t>Aerial roots support, climb or take up moisture and sunlight (orchids, English ivy) (24.3.32, 24.3.33).</w:t>
       </w:r>
     </w:p>
     <w:p>
@@ -1552,25 +1340,34 @@
       </w:pPr>
       <w:r>
         <w:rPr/>
-        <w:t>Erosion is water or wind carrying soil away. Crop rotation, reduced tillage, companion crops and trees reduce it (25.1.17, 25.1.18).</w:t>
+        <w:t>Root partners (24.3.34): mycorrhizae are mutualistic fungi on roots that help extract water and minerals. Root nodules hold nitrogen-fixing bacteria: plants can't extract nitrogen from the air, but the bacteria take it up and reduce it, so the plant gets nitrogen and the bacteria get carbohydrates.</w:t>
+      </w:r>
+    </w:p>
+    <w:p>
+      <w:pPr>
+        <w:pStyle w:val="Guidetext"/>
+      </w:pPr>
+      <w:r>
+        <w:rPr/>
+        <w:t>Traps: root cap (protects the tip) vs root hairs (absorb, in the zone of maturation); endodermis (Casparian strip, controls entry) vs pericycle (makes branch roots); taproot vs fibrous roots; mycorrhizae (fungi) vs nodules (bacteria) (24.3.26, 24.3.27, 24.3.32, 24.3.34).</w:t>
       </w:r>
     </w:p>
     <w:p>
       <w:pPr>
         <w:pStyle w:val="Guidepart"/>
       </w:pPr>
-      <w:bookmarkStart w:id="17" w:name="g252"/>
+      <w:bookmarkStart w:id="12" w:name="g244"/>
       <w:r>
         <w:rPr>
           <w:rStyle w:val="Slidecode"/>
         </w:rPr>
-        <w:t>25.2 Water and Mineral Uptake</w:t>
-      </w:r>
-      <w:r>
-        <w:rPr/>
-        <w:t xml:space="preserve"> (slides 19–27)</w:t>
-      </w:r>
-      <w:bookmarkEnd w:id="17"/>
+        <w:t>24.4 Organization and Diversity of Stems</w:t>
+      </w:r>
+      <w:r>
+        <w:rPr/>
+        <w:t xml:space="preserve"> (slides 35–49)</w:t>
+      </w:r>
+      <w:bookmarkEnd w:id="12"/>
     </w:p>
     <w:p>
       <w:pPr>
@@ -1578,7 +1375,7 @@
       </w:pPr>
       <w:r>
         <w:rPr/>
-        <w:t>Water and minerals enter the root by the same pathways: between the porous cell walls until the Casparian strip forces them into the endodermal cells, or through root hairs and from cell to cell (25.2.19).</w:t>
+        <w:t>A woody twig (24.4.35, 24.4.36): the terminal bud at the tip holds the shoot tip, protected by bud scales. Each spring the scales drop and leave a ring of scars, so each scar ring marks one year of growth. Leaves attach at nodes, with axillary buds; lenticels dot the bark.</w:t>
       </w:r>
     </w:p>
     <w:p>
@@ -1587,7 +1384,52 @@
       </w:pPr>
       <w:r>
         <w:rPr/>
-        <w:t>Plant cells spend energy to take up minerals actively and concentrate them; the Casparian strip prevents minerals from leaking back out (25.2.20).</w:t>
+        <w:t>The shoot apical meristem, inside the terminal bud and wrapped in leaf primordia (young leaves), makes the cells that lengthen the stem. Its primary meristems: protoderm makes the epidermis, ground meristem makes the pith and cortex, procambium makes primary xylem and phloem. Mature vascular bundles also contain vascular cambium (24.4.35, 24.4.37).</w:t>
+      </w:r>
+    </w:p>
+    <w:p>
+      <w:pPr>
+        <w:pStyle w:val="Guidetext"/>
+      </w:pPr>
+      <w:r>
+        <w:rPr/>
+        <w:t>Herbaceous (non-woody) stems have only primary growth and a waxy cuticle. Their vascular bundles are in a distinct ring in eudicots, with cortex outside and pith inside, and scattered in monocots (24.4.38, 24.4.39, 24.4.40).</w:t>
+      </w:r>
+    </w:p>
+    <w:p>
+      <w:pPr>
+        <w:pStyle w:val="Guidetext"/>
+      </w:pPr>
+      <w:r>
+        <w:rPr/>
+        <w:t>Woody stems have both primary growth, which adds length, and secondary growth, which adds girth (thickness). Secondary tissues come from lateral meristems: the vascular cambium makes secondary xylem and secondary phloem each year, and the cork cambium makes cork (24.4.41, 24.4.42, 24.4.43).</w:t>
+      </w:r>
+    </w:p>
+    <w:p>
+      <w:pPr>
+        <w:pStyle w:val="Guidetext"/>
+      </w:pPr>
+      <w:r>
+        <w:rPr/>
+        <w:t>A woody stem has three regions: bark, wood and pith (24.4.42, 24.4.46). The slide's "woody stems have no vascular tissue" is wrong (the professor confirmed it): wood is secondary xylem and bark contains phloem (24.4.44, 24.4.45). The slide also lists only bark and pith; the third region is wood.</w:t>
+      </w:r>
+    </w:p>
+    <w:p>
+      <w:pPr>
+        <w:pStyle w:val="Guidetext"/>
+      </w:pPr>
+      <w:r>
+        <w:rPr/>
+        <w:t>Bark is everything outside the vascular cambium: cork, cork cambium, cortex and phloem (24.4.44). Girdling, removing a ring of bark all the way around, kills the tree, because the phloem in the bark can no longer carry organic nutrients (24.4.44).</w:t>
+      </w:r>
+    </w:p>
+    <w:p>
+      <w:pPr>
+        <w:pStyle w:val="Guidetext"/>
+      </w:pPr>
+      <w:r>
+        <w:rPr/>
+        <w:t>Wood is secondary xylem that builds up year after year; the vascular cambium is dormant in winter. Each annual ring is spring wood plus summer wood, and summer wood has fewer vessels, so counting rings gives the age. Sapwood, the outer rings, still carries water; heartwood, the inner rings of older trees, no longer does (24.4.45, 24.4.46, 24.4.47).</w:t>
       </w:r>
     </w:p>
     <w:p>
@@ -1596,7 +1438,7 @@
       </w:pPr>
       <w:r>
         <w:rPr/>
-        <w:t>Order of mineral uptake</w:t>
+        <w:t>Stem types (24.4.48, 24.4.49)</w:t>
       </w:r>
     </w:p>
     <w:p>
@@ -1609,7 +1451,7 @@
       </w:pPr>
       <w:r>
         <w:rPr/>
-        <w:t>1. A proton pump in the plasma membrane pushes hydrogen ions (H+) out of the cell (25.2.21).</w:t>
+        <w:t>Stolons: above-ground horizontal stems that make new plants where their nodes touch the ground (strawberry runners) (24.4.48, 24.4.49).</w:t>
       </w:r>
     </w:p>
     <w:p>
@@ -1622,7 +1464,7 @@
       </w:pPr>
       <w:r>
         <w:rPr/>
-        <w:t>2. The resulting electrochemical gradient drives positive ions such as K+ into the cell, through channel proteins (25.2.21, 25.2.23).</w:t>
+        <w:t>Rhizomes: underground horizontal stems that contribute to asexual reproduction (iris) (24.4.48, 24.4.49).</w:t>
       </w:r>
     </w:p>
     <w:p>
@@ -1635,108 +1477,8 @@
       </w:pPr>
       <w:r>
         <w:rPr/>
-        <w:t>3. Negative mineral ions, such as nitrate, come in together with H+ through carrier proteins (25.2.21, 25.2.23).</w:t>
-      </w:r>
-    </w:p>
-    <w:p>
-      <w:pPr>
-        <w:pStyle w:val="Guidetext"/>
-      </w:pPr>
-      <w:r>
-        <w:rPr/>
-        <w:t>Helpers (25.2.24, 25.2.25, 25.2.26): Rhizobium bacteria in root nodules fix nitrogen from the air, and the host plant gives them carbohydrates; mycorrhizal fungi add surface for taking up water and minerals, and get sugars from the root. Other plants get nutrients other ways: parasitic plants tap a host plant, and carnivorous plants such as the sundew digest insects (25.2.27).</w:t>
-      </w:r>
-    </w:p>
-    <w:p>
-      <w:pPr>
-        <w:pStyle w:val="Guidepart"/>
-      </w:pPr>
-      <w:bookmarkStart w:id="18" w:name="g253"/>
-      <w:r>
-        <w:rPr>
-          <w:rStyle w:val="Slidecode"/>
-        </w:rPr>
-        <w:t>25.3 Transport Mechanisms in Plants</w:t>
-      </w:r>
-      <w:r>
-        <w:rPr/>
-        <w:t xml:space="preserve"> (slides 28–48)</w:t>
-      </w:r>
-      <w:bookmarkEnd w:id="18"/>
-    </w:p>
-    <w:p>
-      <w:pPr>
-        <w:pStyle w:val="Guidetext"/>
-      </w:pPr>
-      <w:r>
-        <w:rPr/>
-        <w:t>Xylem carries water and minerals from the bottom of the plant to the top, through tracheids and vessel elements. Phloem carries sucrose in any direction, through sieve-tube members with companion cells (25.3.28, 25.3.29).</w:t>
-      </w:r>
-    </w:p>
-    <w:p>
-      <w:pPr>
-        <w:pStyle w:val="Guidetext"/>
-      </w:pPr>
-      <w:r>
-        <w:rPr/>
-        <w:t>Water potential is the energy of water. Water moves passively from higher to lower water potential: from the soil into the root, up the stem, out of the leaves into the air (25.3.31, 25.3.32). Pressure raises water potential and dissolved solutes lower it (25.3.33). Turgor pressure, the pressure of water inside a cell, keeps it firm; a wilted plant has lost it (25.3.34).</w:t>
-      </w:r>
-    </w:p>
-    <w:p>
-      <w:pPr>
-        <w:pStyle w:val="Guidetext"/>
-      </w:pPr>
-      <w:r>
-        <w:rPr/>
-        <w:t>Water entering the roots creates root pressure, which pushes some water up and can force droplets out of leaf edges (guttation) (25.3.35, 25.3.36).</w:t>
-      </w:r>
-    </w:p>
-    <w:p>
-      <w:pPr>
-        <w:pStyle w:val="Guidetext"/>
-      </w:pPr>
-      <w:r>
-        <w:rPr/>
-        <w:t>Cohesion-tension model (25.3.37, 25.3.38, 25.3.39): transpiration, water evaporating from the leaves through stomata, pulls on the water in the xylem. Cohesion (water molecules clinging together) keeps the column unbroken from leaf to root, and adhesion (water clinging to the vessel walls) holds it up. It's passive: the plant spends no energy.</w:t>
-      </w:r>
-    </w:p>
-    <w:p>
-      <w:pPr>
-        <w:pStyle w:val="Guidetext"/>
-      </w:pPr>
-      <w:r>
-        <w:rPr/>
-        <w:t>Stomata (25.3.41, 25.3.42): each stoma is bordered by two guard cells. Potassium ions are actively pumped into the guard cells, water follows by osmosis, turgor rises and the stoma opens; when they leave, it closes. Light regulates opening and closing, and the hormone ABA can close them. The waxy cuticle prevents water loss while they're closed (25.3.39).</w:t>
-      </w:r>
-    </w:p>
-    <w:p>
-      <w:pPr>
-        <w:pStyle w:val="Guidetext"/>
-      </w:pPr>
-      <w:r>
-        <w:rPr/>
-        <w:t>Pressure-flow model (25.3.43 to 25.3.47): at a source (a leaf), sucrose is actively loaded into the sieve tubes using a hydrogen-ion gradient (25.3.45). Water follows by osmosis, building pressure that pushes the sap to a sink, such as roots or fruit, where the sugar is unloaded and used or stored (25.3.46). Evidence: girdling makes the bark swell just above the cut, where sugar collects, and aphids tap the sieve tubes to collect phloem sap (25.3.43, 25.3.48).</w:t>
-      </w:r>
-    </w:p>
-    <w:p>
-      <w:pPr>
-        <w:pStyle w:val="Guidetext"/>
-      </w:pPr>
-      <w:r>
-        <w:rPr/>
-        <w:t>Traps: cohesion vs adhesion; source vs sink; xylem (bottom to top, pulled) vs phloem (any direction, pushed); minerals taken up actively vs water entering passively (25.2.20, 25.3.29, 25.3.37, 25.3.43).</w:t>
-      </w:r>
-    </w:p>
-    <w:p>
-      <w:pPr>
-        <w:pStyle w:val="Guidepart"/>
-      </w:pPr>
-      <w:bookmarkStart w:id="19" w:name="g259"/>
-      <w:r>
-        <w:rPr/>
-        <w:t>Look these up, don't memorize</w:t>
-      </w:r>
-      <w:bookmarkEnd w:id="19"/>
+        <w:t>Tubers: enlarged parts of rhizomes that store food; a potato is a tuber (24.4.48, 24.4.49).</w:t>
+      </w:r>
     </w:p>
     <w:p>
       <w:pPr>
@@ -1748,7 +1490,7 @@
       </w:pPr>
       <w:r>
         <w:rPr/>
-        <w:t>Which nutrients are macro and micro: the nutrients table (add N, which the slide leaves out).</w:t>
+        <w:t>Corms: underground stems that make new plants the next season (gladiolus) (24.4.48, 24.4.49).</w:t>
       </w:r>
     </w:p>
     <w:p>
@@ -1761,8 +1503,99 @@
       </w:pPr>
       <w:r>
         <w:rPr/>
-        <w:t>Soil horizons A, B and C: the soil table.</w:t>
-      </w:r>
+        <w:t>Uses: sugar cane stems give table sugar; bark gives cinnamon and quinine; wood gives paper and building materials (24.4.48).</w:t>
+      </w:r>
+    </w:p>
+    <w:p>
+      <w:pPr>
+        <w:pStyle w:val="Guidetext"/>
+      </w:pPr>
+      <w:r>
+        <w:rPr/>
+        <w:t>Traps: primary growth (length, apical meristems) vs secondary growth (girth, lateral meristems); bark vs wood; spring vs summer wood; heartwood vs sapwood; stolon (above ground) vs rhizome (below ground); bundles in a ring (eudicot) vs scattered (monocot) (24.4.38, 24.4.42, 24.4.45, 24.4.47, 24.4.48).</w:t>
+      </w:r>
+    </w:p>
+    <w:p>
+      <w:pPr>
+        <w:pStyle w:val="Guidepart"/>
+      </w:pPr>
+      <w:bookmarkStart w:id="13" w:name="g245"/>
+      <w:r>
+        <w:rPr>
+          <w:rStyle w:val="Slidecode"/>
+        </w:rPr>
+        <w:t>24.5 Organization and Diversity of Leaves</w:t>
+      </w:r>
+      <w:r>
+        <w:rPr/>
+        <w:t xml:space="preserve"> (slides 50–55)</w:t>
+      </w:r>
+      <w:bookmarkEnd w:id="13"/>
+    </w:p>
+    <w:p>
+      <w:pPr>
+        <w:pStyle w:val="Guidetext"/>
+      </w:pPr>
+      <w:r>
+        <w:rPr/>
+        <w:t>The leaf carries on most of the plant's photosynthesis, which needs water, carbon dioxide and sunlight (24.5.50). A foliage leaf is usually broad and thin: the blade is the wide part, the petiole is the stalk attaching it to the stem, and the leaf axil, the upper angle between petiole and stem, holds the axillary bud (24.5.50). Evergreens keep their leaves all year; deciduous plants lose all of them (24.5.50).</w:t>
+      </w:r>
+    </w:p>
+    <w:p>
+      <w:pPr>
+        <w:pStyle w:val="Guidetext"/>
+      </w:pPr>
+      <w:r>
+        <w:rPr/>
+        <w:t>Inside a leaf (24.5.51, 24.5.52): upper and lower epidermis with a waxy cuticle and trichomes; stomata in the lower epidermis for gas exchange; and mesophyll, the chloroplast-filled middle. In eudicots the mesophyll has two layers: palisade mesophyll, elongated cells near the top, and spongy mesophyll, irregular cells bounded by air spaces. Leaf veins bring water and minerals in through the xylem and carry sugar out through the phloem.</w:t>
+      </w:r>
+    </w:p>
+    <w:p>
+      <w:pPr>
+        <w:pStyle w:val="Guidetext"/>
+      </w:pPr>
+      <w:r>
+        <w:rPr/>
+        <w:t>The palisade layer does most of the photosynthesis, and the spongy layer's air spaces let carbon dioxide spread through the leaf (textbook). Carbon dioxide enters through the stomata, and oxygen and water vapor leave; the figure description saying carbon dioxide leaves is a slip (24.5.52).</w:t>
+      </w:r>
+    </w:p>
+    <w:p>
+      <w:pPr>
+        <w:pStyle w:val="Guidetext"/>
+      </w:pPr>
+      <w:r>
+        <w:rPr/>
+        <w:t>Leaf variety (24.5.53, 24.5.54): leaves are arranged on the stem as alternate (beech), opposite (maple) or whorled (bedstraw); a simple leaf has one blade (magnolia), while a compound leaf is divided into leaflets, pinnately in pairs (black walnut) or palmately from one point (buckeye).</w:t>
+      </w:r>
+    </w:p>
+    <w:p>
+      <w:pPr>
+        <w:pStyle w:val="Guidetext"/>
+      </w:pPr>
+      <w:r>
+        <w:rPr/>
+        <w:t>Leaves are adapted to their environment (24.5.53, 24.5.55; examples from the textbook): broad shade leaves; cactus spines, which are modified leaves that protect the fleshy stem; climbing leaves modified into tendrils (cucumber); reduced leaves (desert plants); and insect-catching leaves, as in the sundew (sticky hairs) and the Venus flytrap (hinged leaves that snap shut). Carnivorous plants grow where soil nitrogen is scarce, and the digested insects supply it (textbook).</w:t>
+      </w:r>
+    </w:p>
+    <w:p>
+      <w:pPr>
+        <w:pStyle w:val="Guidetext"/>
+      </w:pPr>
+      <w:r>
+        <w:rPr/>
+        <w:t>Traps: blade vs petiole; palisade vs spongy mesophyll; simple vs compound; alternate vs opposite vs whorled; evergreen vs deciduous; cactus spines are leaves, not stems (24.5.50, 24.5.51, 24.5.53, 24.5.55).</w:t>
+      </w:r>
+    </w:p>
+    <w:p>
+      <w:pPr>
+        <w:pStyle w:val="Guidepart"/>
+      </w:pPr>
+      <w:bookmarkStart w:id="14" w:name="g249"/>
+      <w:r>
+        <w:rPr/>
+        <w:t>Look these up, don't memorize</w:t>
+      </w:r>
+      <w:bookmarkEnd w:id="14"/>
     </w:p>
     <w:p>
       <w:pPr>
@@ -1774,7 +1607,7 @@
       </w:pPr>
       <w:r>
         <w:rPr/>
-        <w:t>The three steps of mineral uptake, and how stomata open and close: the sequences.</w:t>
+        <w:t>Primary meristems and what each one makes; the three tissue types and their cells: the tissue tables.</w:t>
       </w:r>
     </w:p>
     <w:p>
@@ -1787,93 +1620,7 @@
       </w:pPr>
       <w:r>
         <w:rPr/>
-        <w:t>Exact numbers (particle sizes, humus percentages, erosion statistics): don't memorize them.</w:t>
-      </w:r>
-    </w:p>
-    <w:p>
-      <w:pPr>
-        <w:pStyle w:val="Chapterheading"/>
-      </w:pPr>
-      <w:r>
-        <w:rPr>
-          <w:rStyle w:val="Slidecode"/>
-        </w:rPr>
-        <w:t>Chapter 26: Flowering Plants: Control of Growth Responses</w:t>
-      </w:r>
-    </w:p>
-    <w:p>
-      <w:pPr>
-        <w:pStyle w:val="Guideheading"/>
-      </w:pPr>
-      <w:bookmarkStart w:id="20" w:name="g260"/>
-      <w:r>
-        <w:rPr>
-          <w:rStyle w:val="Slidecode"/>
-        </w:rPr>
-        <w:t>Quick guide: the big picture</w:t>
-      </w:r>
-      <w:bookmarkEnd w:id="20"/>
-    </w:p>
-    <w:p>
-      <w:pPr>
-        <w:pStyle w:val="Guidetext"/>
-      </w:pPr>
-      <w:r>
-        <w:rPr/>
-        <w:t>Plants can't move away from danger or toward food, so they respond by changing how they grow (26.1.3). Ch 26 covers the hormones that carry signals around the plant (26.1), growth and movement responses to light, gravity and touch (26.2), and phytochrome, the pigment that lets plants measure day and night length (26.3).</w:t>
-      </w:r>
-    </w:p>
-    <w:p>
-      <w:pPr>
-        <w:pStyle w:val="Guidepart"/>
-      </w:pPr>
-      <w:bookmarkStart w:id="21" w:name="g261"/>
-      <w:r>
-        <w:rPr>
-          <w:rStyle w:val="Slidecode"/>
-        </w:rPr>
-        <w:t>26.1 Plant Hormones</w:t>
-      </w:r>
-      <w:r>
-        <w:rPr/>
-        <w:t xml:space="preserve"> (slides 3–23)</w:t>
-      </w:r>
-      <w:bookmarkEnd w:id="21"/>
-    </w:p>
-    <w:p>
-      <w:pPr>
-        <w:pStyle w:val="Guidetext"/>
-      </w:pPr>
-      <w:r>
-        <w:rPr/>
-        <w:t>Plants respond to stimuli such as light, gravity, carbon dioxide, infection, drought and touch. Some responses are short-term (stomata opening and closing); others are long-term (roots growing down and stems growing up) (26.1.3).</w:t>
-      </w:r>
-    </w:p>
-    <w:p>
-      <w:pPr>
-        <w:pStyle w:val="Guidetext"/>
-      </w:pPr>
-      <w:r>
-        <w:rPr/>
-        <w:t>Signal transduction (26.1.4, 26.1.5): a receptor is activated by a signal; a chain of relay proteins amplifies it and passes it on; the cell responds, often by turning genes on or off.</w:t>
-      </w:r>
-    </w:p>
-    <w:p>
-      <w:pPr>
-        <w:pStyle w:val="Guidetext"/>
-      </w:pPr>
-      <w:r>
-        <w:rPr/>
-        <w:t>Hormones are chemical signals made in one part of the plant that travel in the phloem or from cell to cell and coordinate cell responses (26.1.6).</w:t>
-      </w:r>
-    </w:p>
-    <w:p>
-      <w:pPr>
-        <w:pStyle w:val="Guidesubheading"/>
-      </w:pPr>
-      <w:r>
-        <w:rPr/>
-        <w:t>The five hormones</w:t>
+        <w:t>Root zones and root tissues in order, root types and root specializations: the root tables.</w:t>
       </w:r>
     </w:p>
     <w:p>
@@ -1886,7 +1633,7 @@
       </w:pPr>
       <w:r>
         <w:rPr/>
-        <w:t>Auxin: made in the shoot apical meristem. It stops the axillary buds below from growing (apical dominance), promotes root and fruit growth, prevents leaf loss, and bends stems toward light (26.1.8). Synthetic auxins are used as weed killers (26.1.10).</w:t>
+        <w:t>Monocot vs eudicot: the comparison table.</w:t>
       </w:r>
     </w:p>
     <w:p>
@@ -1899,7 +1646,7 @@
       </w:pPr>
       <w:r>
         <w:rPr/>
-        <w:t>Gibberellins: growth-promoting hormones that cause stem elongation and break dormancy (26.1.12, 26.1.13).</w:t>
+        <w:t>Stem types, leaf arrangements and leaf adaptations: the stem and leaf tables.</w:t>
       </w:r>
     </w:p>
     <w:p>
@@ -1912,7 +1659,129 @@
       </w:pPr>
       <w:r>
         <w:rPr/>
-        <w:t>Cytokinins: promote cell division and organ formation; with auxin, their ratio decides which organs form; low levels in autumn let leaves change color and die (26.1.14, 26.1.15, 26.1.16).</w:t>
+        <w:t>Exact numbers: don't memorize them.</w:t>
+      </w:r>
+    </w:p>
+    <w:p>
+      <w:pPr>
+        <w:pStyle w:val="Chapterheading"/>
+      </w:pPr>
+      <w:r>
+        <w:rPr>
+          <w:rStyle w:val="Slidecode"/>
+        </w:rPr>
+        <w:t>Chapter 25: Flowering Plants: Nutrition and Transport</w:t>
+      </w:r>
+    </w:p>
+    <w:p>
+      <w:pPr>
+        <w:pStyle w:val="Guideheading"/>
+      </w:pPr>
+      <w:bookmarkStart w:id="15" w:name="g250"/>
+      <w:r>
+        <w:rPr>
+          <w:rStyle w:val="Slidecode"/>
+        </w:rPr>
+        <w:t>Quick guide: the big picture</w:t>
+      </w:r>
+      <w:bookmarkEnd w:id="15"/>
+    </w:p>
+    <w:p>
+      <w:pPr>
+        <w:pStyle w:val="Guidetext"/>
+      </w:pPr>
+      <w:r>
+        <w:rPr/>
+        <w:t>Ch 25 is about how a plant feeds itself and moves materials around. A plant builds most of its body from carbon dioxide and water; everything else comes from the soil as minerals (25.1.3). Water and minerals travel up in the xylem, and sugar travels in the phloem to wherever it's needed (25.3.28, 25.3.29).</w:t>
+      </w:r>
+    </w:p>
+    <w:p>
+      <w:pPr>
+        <w:pStyle w:val="Guidetext"/>
+      </w:pPr>
+      <w:r>
+        <w:rPr/>
+        <w:t>Most of the chapter is about how things move. Water always moves passively, from higher to lower water potential, and the plant spends no energy on it (25.3.31, 25.3.37). Minerals and sugar are moved actively: a pump uses ATP to push hydrogen ions (H+) out of a cell, and the H+ gradient then drives minerals and sugar across the membrane (25.2.21, 25.3.45).</w:t>
+      </w:r>
+    </w:p>
+    <w:p>
+      <w:pPr>
+        <w:pStyle w:val="Guidetext"/>
+      </w:pPr>
+      <w:r>
+        <w:rPr/>
+        <w:t>This deck is from the same edition as the textbook, so the slides and the book match closely.</w:t>
+      </w:r>
+    </w:p>
+    <w:p>
+      <w:pPr>
+        <w:pStyle w:val="Guidepart"/>
+      </w:pPr>
+      <w:bookmarkStart w:id="16" w:name="g251"/>
+      <w:r>
+        <w:rPr>
+          <w:rStyle w:val="Slidecode"/>
+        </w:rPr>
+        <w:t>25.1 Plant Nutrition and Soil</w:t>
+      </w:r>
+      <w:r>
+        <w:rPr/>
+        <w:t xml:space="preserve"> (slides 3–18)</w:t>
+      </w:r>
+      <w:bookmarkEnd w:id="16"/>
+    </w:p>
+    <w:p>
+      <w:pPr>
+        <w:pStyle w:val="Guidetext"/>
+      </w:pPr>
+      <w:r>
+        <w:rPr/>
+        <w:t>About 95% of a plant's dry weight is carbon, hydrogen and oxygen, the building blocks of organic compounds such as carbohydrates. Carbon dioxide supplies the carbon, and water supplies the hydrogen and oxygen (25.1.3). Everything else is absorbed by the roots as minerals; a mineral is an inorganic substance, usually with two or more elements (25.1.3).</w:t>
+      </w:r>
+    </w:p>
+    <w:p>
+      <w:pPr>
+        <w:pStyle w:val="Guidetext"/>
+      </w:pPr>
+      <w:r>
+        <w:rPr/>
+        <w:t>Leaves take in carbon dioxide and release oxygen and water; roots take in water, oxygen and minerals and release carbon dioxide, because root cells carry on cellular respiration (25.1.5). That's why roots need air in the soil: overwatering fills the air spaces and the plant dies (textbook).</w:t>
+      </w:r>
+    </w:p>
+    <w:p>
+      <w:pPr>
+        <w:pStyle w:val="Guidetext"/>
+      </w:pPr>
+      <w:r>
+        <w:rPr/>
+        <w:t>A nutrient is essential if it has an identifiable role, no other nutrient can substitute for it, and a deficiency causes the plant to die (25.1.4). Essential nutrients are macronutrients, needed in larger amounts (C, H, O, N, P, K, S, Ca, Mg), or micronutrients, needed in smaller amounts (Fe, B, Mn, Cu, Zn, Cl, Mo) (25.1.4). The slide's macronutrient list leaves out nitrogen (N); the textbook includes it.</w:t>
+      </w:r>
+    </w:p>
+    <w:p>
+      <w:pPr>
+        <w:pStyle w:val="Guidetext"/>
+      </w:pPr>
+      <w:r>
+        <w:rPr/>
+        <w:t>Why minerals matter (textbook): nitrogen goes into nucleic acids and proteins, magnesium into chlorophyll, and iron into cytochromes.</w:t>
+      </w:r>
+    </w:p>
+    <w:p>
+      <w:pPr>
+        <w:pStyle w:val="Guidetext"/>
+      </w:pPr>
+      <w:r>
+        <w:rPr/>
+        <w:t>Hydroponics, growing plants in water with dissolved nutrients, proved that plants need only sunlight, water and minerals; leaving one nutrient out and watching growth suffer shows it's essential (25.1.6, 25.1.7). Deficiencies cause stunted growth and other symptoms, such as light yellow leaves without nitrogen (25.1.6, 25.1.8). Fertilizer's NPK ratio is its percentage by weight of nitrogen, phosphorus and potassium (25.1.6, 25.1.8).</w:t>
+      </w:r>
+    </w:p>
+    <w:p>
+      <w:pPr>
+        <w:pStyle w:val="Guidesubheading"/>
+      </w:pPr>
+      <w:r>
+        <w:rPr/>
+        <w:t>Soil</w:t>
       </w:r>
     </w:p>
     <w:p>
@@ -1925,7 +1794,7 @@
       </w:pPr>
       <w:r>
         <w:rPr/>
-        <w:t>Abscisic acid (ABA), the stress hormone: starts and maintains seed and bud dormancy and closes stomata. Corn that can't respond to it sprouts on the cob (26.1.17, 26.1.18, 26.1.19).</w:t>
+        <w:t>Soil is a mixture of mineral particles, decaying organic material, living organisms, air and water (25.1.9).</w:t>
       </w:r>
     </w:p>
     <w:p>
@@ -1938,60 +1807,7 @@
       </w:pPr>
       <w:r>
         <w:rPr/>
-        <w:t>Ethylene: a gas made from the amino acid methionine; it causes leaves, fruit or flowers to drop (abscission) and ripens fruit (26.1.20, 26.1.21, 26.1.22).</w:t>
-      </w:r>
-    </w:p>
-    <w:p>
-      <w:pPr>
-        <w:pStyle w:val="Guidetext"/>
-      </w:pPr>
-      <w:r>
-        <w:rPr/>
-        <w:t>How auxin bends a stem toward light (26.1.9, 26.1.11): when light comes from one side, auxin moves to the shady side. There, cells pump hydrogen ions into their walls, the walls loosen, water enters and the cells stretch, so the stem bends toward the light.</w:t>
-      </w:r>
-    </w:p>
-    <w:p>
-      <w:pPr>
-        <w:pStyle w:val="Guidetext"/>
-      </w:pPr>
-      <w:r>
-        <w:rPr/>
-        <w:t>Plants also defend themselves against living threats, such as plant-eaters and parasites, by making protective chemicals (26.1.23).</w:t>
-      </w:r>
-    </w:p>
-    <w:p>
-      <w:pPr>
-        <w:pStyle w:val="Guidepart"/>
-      </w:pPr>
-      <w:bookmarkStart w:id="22" w:name="g262"/>
-      <w:r>
-        <w:rPr>
-          <w:rStyle w:val="Slidecode"/>
-        </w:rPr>
-        <w:t>26.2 Plant Growth and Movement Responses</w:t>
-      </w:r>
-      <w:r>
-        <w:rPr/>
-        <w:t xml:space="preserve"> (slides 24–35)</w:t>
-      </w:r>
-      <w:bookmarkEnd w:id="22"/>
-    </w:p>
-    <w:p>
-      <w:pPr>
-        <w:pStyle w:val="Guidetext"/>
-      </w:pPr>
-      <w:r>
-        <w:rPr/>
-        <w:t>A tropism is growth toward (positive) or away from (negative) a stimulus that comes from one direction (26.2.24).</w:t>
-      </w:r>
-    </w:p>
-    <w:p>
-      <w:pPr>
-        <w:pStyle w:val="Guidesubheading"/>
-      </w:pPr>
-      <w:r>
-        <w:rPr/>
-        <w:t>Tropisms</w:t>
+        <w:t>It forms by weathering of rock: mechanical (wind, rain, ice, rock grinding on rock) or chemical (acid rain, degradation by lichens and mosses) (25.1.9).</w:t>
       </w:r>
     </w:p>
     <w:p>
@@ -2004,7 +1820,7 @@
       </w:pPr>
       <w:r>
         <w:rPr/>
-        <w:t>Phototropism (light): stems grow toward light because cells on the shady side elongate under auxin. The receptor pigment, phototropin, absorbs blue light (26.2.25, 26.2.26).</w:t>
+        <w:t>Particles: sand is largest, and water drains readily between the grains; silt is in between; clay is smallest, with small spaces that fill with water. Loam combines sand's aeration with the mineral retention of silt and clay (25.1.10).</w:t>
       </w:r>
     </w:p>
     <w:p>
@@ -2017,7 +1833,7 @@
       </w:pPr>
       <w:r>
         <w:rPr/>
-        <w:t>Thigmotropism (touch): tendrils of runner beans and morning glories coil around supports. Thigmomorphogenesis is a change in the whole plant's shape because of touch or wind (26.2.27).</w:t>
+        <w:t>Humus (decaying organic material) decreases runoff, prevents leaching (minerals being washed away), makes soil more acidic and retains positively charged minerals; bacteria and fungi break it down and return its nutrients to plants (25.1.11).</w:t>
       </w:r>
     </w:p>
     <w:p>
@@ -2030,7 +1846,7 @@
       </w:pPr>
       <w:r>
         <w:rPr/>
-        <w:t>Gravitropism (gravity): a plant laid on its side grows its stem upward and its roots downward. Statoliths, starch grains inside amyloplasts in root-cap cells, settle to the bottom of the cell and signal which way is down (26.2.29). The slide's "stems with root caps grow downward" means roots.</w:t>
+        <w:t>Living organisms: plant roots open soil to bedrock, earthworms and ants mix and aerate it, microorganisms decompose humus, and soil bacteria make nitrogen available to plants (25.1.14).</w:t>
       </w:r>
     </w:p>
     <w:p>
@@ -2039,7 +1855,7 @@
       </w:pPr>
       <w:r>
         <w:rPr/>
-        <w:t>Arabidopsis thaliana, a small plant related to cabbage and mustard with no commercial value, is the model organism for studying plant molecular genetics (26.2.31).</w:t>
+        <w:t>Cation exchange (25.1.12, 25.1.13): clay and humus are negatively charged, so they hold positive mineral ions such as calcium (Ca2+) and potassium (K+), which keeps them from leaching away. A root hair releases hydrogen ions (H+), which exchange places with those minerals, so the root can take them up. Cation exchange capacity (CEC) is how many negative sites a soil has to bind them; sandy soil has a lower CEC.</w:t>
       </w:r>
     </w:p>
     <w:p>
@@ -2048,25 +1864,43 @@
       </w:pPr>
       <w:r>
         <w:rPr/>
-        <w:t>Turgor (nastic) movements don't involve growth and don't depend on the stimulus's direction; they come from changes in water pressure inside cells. Examples: Mimosa leaflets folding when touched, the Venus flytrap closing, and daily sleep movements (26.2.33, 26.2.35).</w:t>
+        <w:t>A soil profile is a vertical section from the surface down to unaltered rock, in layers called horizons (25.1.15, 25.1.16): A, the topsoil, with litter and the most humus; B, the subsoil, where inorganic nutrients leached from above accumulate; C, the weathered parent material (bedrock). The profile varies with the parent rock and climate.</w:t>
+      </w:r>
+    </w:p>
+    <w:p>
+      <w:pPr>
+        <w:pStyle w:val="Guidetext"/>
+      </w:pPr>
+      <w:r>
+        <w:rPr/>
+        <w:t>Erosion is water or wind carrying soil away; plowing, overgrazing, clearing land and stronger coastal storms make it worse. Crop rotation, reduced tillage and companion crops reduce farmland erosion, and trees prevent coastal erosion (25.1.17, 25.1.18).</w:t>
+      </w:r>
+    </w:p>
+    <w:p>
+      <w:pPr>
+        <w:pStyle w:val="Guidetext"/>
+      </w:pPr>
+      <w:r>
+        <w:rPr/>
+        <w:t>Traps: macro vs micro (amount needed, not importance); sand (drains) vs clay (holds water); A vs B vs C horizon; leaching vs cation exchange (25.1.4, 25.1.10, 25.1.12, 25.1.15).</w:t>
       </w:r>
     </w:p>
     <w:p>
       <w:pPr>
         <w:pStyle w:val="Guidepart"/>
       </w:pPr>
-      <w:bookmarkStart w:id="23" w:name="g263"/>
+      <w:bookmarkStart w:id="17" w:name="g252"/>
       <w:r>
         <w:rPr>
           <w:rStyle w:val="Slidecode"/>
         </w:rPr>
-        <w:t>26.3 Plant Responses to Phytochrome</w:t>
-      </w:r>
-      <w:r>
-        <w:rPr/>
-        <w:t xml:space="preserve"> (slides 36–46)</w:t>
-      </w:r>
-      <w:bookmarkEnd w:id="23"/>
+        <w:t>25.2 Water and Mineral Uptake</w:t>
+      </w:r>
+      <w:r>
+        <w:rPr/>
+        <w:t xml:space="preserve"> (slides 19–27)</w:t>
+      </w:r>
+      <w:bookmarkEnd w:id="17"/>
     </w:p>
     <w:p>
       <w:pPr>
@@ -2074,7 +1908,7 @@
       </w:pPr>
       <w:r>
         <w:rPr/>
-        <w:t>Photoperiodism is any response to changes in day or night length, such as when to flower. It needs a biological clock and a photoreceptor pigment called phytochrome (26.3.36).</w:t>
+        <w:t>Water and minerals enter the root by the same two pathways (25.2.19, 25.2.23): pathway A, between the porous cell walls until the Casparian strip of the endodermis blocks the way and forces them into the endodermal cells; pathway B, into root hairs and then from cell to cell through plasmodesmata (cytoplasmic strands connecting neighboring cells). Either way, everything reaching the xylem has passed through the endodermal cells.</w:t>
       </w:r>
     </w:p>
     <w:p>
@@ -2083,55 +1917,17 @@
       </w:pPr>
       <w:r>
         <w:rPr/>
-        <w:t>Phytochrome has two forms (26.3.37, 26.3.38, 26.3.39): Pr absorbs red light (in daylight) and becomes Pfr, the active form; Pfr turns back into Pr in darkness or far-red light. Switching between them lets the plant detect changes in day length. Phytochrome also promotes seed germination and flowering and inhibits shoot elongation.</w:t>
-      </w:r>
-    </w:p>
-    <w:p>
-      <w:pPr>
-        <w:pStyle w:val="Guidetext"/>
-      </w:pPr>
-      <w:r>
-        <w:rPr/>
-        <w:t>Flowering (26.3.40, 26.3.41, 26.3.42): short-day plants flower when the day is shorter than a critical length, so they're really long-night plants; long-day plants flower when the day is longer. A flash of light that interrupts the long night stops a short-day plant from flowering but lets a long-day plant flower. Day-neutral plants flower whatever the day length.</w:t>
-      </w:r>
-    </w:p>
-    <w:p>
-      <w:pPr>
-        <w:pStyle w:val="Guidetext"/>
-      </w:pPr>
-      <w:r>
-        <w:rPr/>
-        <w:t>Shade and spacing (26.3.43, 26.3.44): leaf shade increases far-red light relative to red, which tells a plant it has neighbors, and it grows taller to compete. In darkness, stems keep elongating and stay yellow (etiolation; textbook).</w:t>
-      </w:r>
-    </w:p>
-    <w:p>
-      <w:pPr>
-        <w:pStyle w:val="Guidetext"/>
-      </w:pPr>
-      <w:r>
-        <w:rPr/>
-        <w:t>Circadian rhythms are roughly 24-hour cycles that keep going even without outside cues, run by a biological clock; sleep movements of leaves are an example (26.3.45, 26.3.46).</w:t>
-      </w:r>
-    </w:p>
-    <w:p>
-      <w:pPr>
-        <w:pStyle w:val="Guidetext"/>
-      </w:pPr>
-      <w:r>
-        <w:rPr/>
-        <w:t>Traps: tropism (growth, directional) vs turgor movement (not growth); Pr vs Pfr; short-day (long-night) vs long-day plants (26.2.24, 26.2.33, 26.3.39, 26.3.41).</w:t>
-      </w:r>
-    </w:p>
-    <w:p>
-      <w:pPr>
-        <w:pStyle w:val="Guidepart"/>
-      </w:pPr>
-      <w:bookmarkStart w:id="24" w:name="g269"/>
-      <w:r>
-        <w:rPr/>
-        <w:t>Look these up, don't memorize</w:t>
-      </w:r>
-      <w:bookmarkEnd w:id="24"/>
+        <w:t>Water enters root cells passively, by osmosis, when there is more water outside the root than inside; the slide words this as the root's osmotic pressure being lower than the soil's (25.2.19). Minerals are different: plant cells spend energy to take them up actively and concentrate them, and the Casparian strip prevents backflow, so root xylem holds far more minerals than the soil (25.2.19, 25.2.20).</w:t>
+      </w:r>
+    </w:p>
+    <w:p>
+      <w:pPr>
+        <w:pStyle w:val="Guidesubheading"/>
+      </w:pPr>
+      <w:r>
+        <w:rPr/>
+        <w:t>Order of mineral uptake across the membrane</w:t>
+      </w:r>
     </w:p>
     <w:p>
       <w:pPr>
@@ -2143,7 +1939,7 @@
       </w:pPr>
       <w:r>
         <w:rPr/>
-        <w:t>Each hormone's effects and commercial uses: the hormone table (26.1.7).</w:t>
+        <w:t>1. A proton pump in the plasma membrane uses ATP to pump hydrogen ions (H+) out of the cell (25.2.21, 25.2.23).</w:t>
       </w:r>
     </w:p>
     <w:p>
@@ -2156,7 +1952,7 @@
       </w:pPr>
       <w:r>
         <w:rPr/>
-        <w:t>Short-day, long-day and day-neutral plants, and what a night flash does: the photoperiod table.</w:t>
+        <w:t>2. The resulting electrochemical gradient drives positive ions such as potassium (K+) into the cell through channel proteins (25.2.21, 25.2.23).</w:t>
       </w:r>
     </w:p>
     <w:p>
@@ -2169,273 +1965,8 @@
       </w:pPr>
       <w:r>
         <w:rPr/>
-        <w:t>Which tropism responds to what, and which receptor: the tropism table.</w:t>
-      </w:r>
-    </w:p>
-    <w:p>
-      <w:pPr>
-        <w:pStyle w:val="Chapterheading"/>
-      </w:pPr>
-      <w:r>
-        <w:rPr>
-          <w:rStyle w:val="Slidecode"/>
-        </w:rPr>
-        <w:t>Chapter 27: Flowering Plants: Reproduction</w:t>
-      </w:r>
-    </w:p>
-    <w:p>
-      <w:pPr>
-        <w:pStyle w:val="Guideheading"/>
-      </w:pPr>
-      <w:bookmarkStart w:id="25" w:name="g270"/>
-      <w:r>
-        <w:rPr>
-          <w:rStyle w:val="Slidecode"/>
-        </w:rPr>
-        <w:t>Quick guide: the big picture</w:t>
-      </w:r>
-      <w:bookmarkEnd w:id="25"/>
-    </w:p>
-    <w:p>
-      <w:pPr>
-        <w:pStyle w:val="Guidetext"/>
-      </w:pPr>
-      <w:r>
-        <w:rPr/>
-        <w:t>Ch 27 follows a flowering plant's life cycle in detail: how a flower makes pollen and the embryo sac, pollination and double fertilization, how the embryo develops inside the seed, fruits and how seeds spread, germination, and reproduction without seeds (27.1.3, 27.2.20, 27.3.27, 27.4.36).</w:t>
-      </w:r>
-    </w:p>
-    <w:p>
-      <w:pPr>
-        <w:pStyle w:val="Guidepart"/>
-      </w:pPr>
-      <w:bookmarkStart w:id="26" w:name="g271"/>
-      <w:r>
-        <w:rPr>
-          <w:rStyle w:val="Slidecode"/>
-        </w:rPr>
-        <w:t>27.1 Sexual Reproductive Strategies</w:t>
-      </w:r>
-      <w:r>
-        <w:rPr/>
-        <w:t xml:space="preserve"> (slides 3–19)</w:t>
-      </w:r>
-      <w:bookmarkEnd w:id="26"/>
-    </w:p>
-    <w:p>
-      <w:pPr>
-        <w:pStyle w:val="Guidetext"/>
-      </w:pPr>
-      <w:r>
-        <w:rPr/>
-        <w:t>The diploid sporophyte, the plant you see, is dominant: it bears the flowers and makes haploid spores by meiosis (27.1.3). A microspore becomes the male gametophyte (the pollen grain), and a megaspore becomes the female gametophyte (27.1.5). The slide calls the spores themselves gametophytes; each spore becomes one.</w:t>
-      </w:r>
-    </w:p>
-    <w:p>
-      <w:pPr>
-        <w:pStyle w:val="Guidetext"/>
-      </w:pPr>
-      <w:r>
-        <w:rPr/>
-        <w:t>Flowers are unique to angiosperms: they attract pollinators and produce fruits that enclose seeds (27.1.6). A eudicot flower has four whorls attached to a receptacle at the end of a stalk called the peduncle: sepals protect the bud, petals attract pollinators, stamens make pollen, and carpels hold the ovules (27.1.7).</w:t>
-      </w:r>
-    </w:p>
-    <w:p>
-      <w:pPr>
-        <w:pStyle w:val="Guidetext"/>
-      </w:pPr>
-      <w:r>
-        <w:rPr/>
-        <w:t>Complete flowers have sepals, petals, stamens and a carpel; incomplete flowers lack one or more. Perfect flowers have both stamens and carpels; imperfect flowers have only one kind (27.1.10). Monoecious plants carry both kinds of imperfect flower; dioecious plants (holly) carry only one kind per plant (27.1.10, 27.1.11).</w:t>
-      </w:r>
-    </w:p>
-    <w:p>
-      <w:pPr>
-        <w:pStyle w:val="Guidetext"/>
-      </w:pPr>
-      <w:r>
-        <w:rPr/>
-        <w:t>Male gametophyte (27.1.12): each anther has four pollen sacs with many microspore mother cells. Meiosis makes four haploid microspores; each becomes a pollen grain with a tube cell and a generative cell, and the generative cell divides into two sperm.</w:t>
-      </w:r>
-    </w:p>
-    <w:p>
-      <w:pPr>
-        <w:pStyle w:val="Guidetext"/>
-      </w:pPr>
-      <w:r>
-        <w:rPr/>
-        <w:t>Female gametophyte (27.1.14): in the ovule, a megaspore mother cell undergoes meiosis to make four megaspores, and three of them die. The survivor divides by mitosis into the embryo sac, with eight nuclei: the egg, two synergids beside it, a central cell with two polar nuclei, and three antipodal cells. The ovule's integuments become the seed coat.</w:t>
-      </w:r>
-    </w:p>
-    <w:p>
-      <w:pPr>
-        <w:pStyle w:val="Guidetext"/>
-      </w:pPr>
-      <w:r>
-        <w:rPr/>
-        <w:t>Pollination is the transfer of pollen from an anther to a stigma: self-pollination if the pollen comes from the same plant, cross-pollination if it comes from another plant of the same species (27.1.15). Fertilization comes afterwards: the pollen grain germinates on the stigma, its pollen tube grows through the style to the ovule's micropyle, and double fertilization follows: one sperm + the egg make the zygote, the other + the polar nuclei make the endosperm (27.1.17).</w:t>
-      </w:r>
-    </w:p>
-    <w:p>
-      <w:pPr>
-        <w:pStyle w:val="Guidetext"/>
-      </w:pPr>
-      <w:r>
-        <w:rPr/>
-        <w:t>Pollinators (27.1.18, 27.1.19; textbook): bees prefer yellow, blue or white flowers with ultraviolet markings; hummingbirds prefer red, tube-shaped flowers with lots of nectar; bats prefer large, pale flowers that open at night.</w:t>
-      </w:r>
-    </w:p>
-    <w:p>
-      <w:pPr>
-        <w:pStyle w:val="Guidepart"/>
-      </w:pPr>
-      <w:bookmarkStart w:id="27" w:name="g272"/>
-      <w:r>
-        <w:rPr>
-          <w:rStyle w:val="Slidecode"/>
-        </w:rPr>
-        <w:t>27.2 Seed Development</w:t>
-      </w:r>
-      <w:r>
-        <w:rPr/>
-        <w:t xml:space="preserve"> (slides 20–26)</w:t>
-      </w:r>
-      <w:bookmarkEnd w:id="27"/>
-    </w:p>
-    <w:p>
-      <w:pPr>
-        <w:pStyle w:val="Guidetext"/>
-      </w:pPr>
-      <w:r>
-        <w:rPr/>
-        <w:t>Development is a programmed series of stages from simple to complex (27.2.20). After double fertilization, the zygote divides into an embryo and a suspensor that anchors it. The embryo goes through a globular stage, then a heart stage when the cotyledons appear, then a torpedo stage as it elongates (27.2.20, 27.2.21).</w:t>
-      </w:r>
-    </w:p>
-    <w:p>
-      <w:pPr>
-        <w:pStyle w:val="Guidetext"/>
-      </w:pPr>
-      <w:r>
-        <w:rPr/>
-        <w:t>The mature embryo (27.2.22): the epicotyl, above the cotyledons, becomes the shoot; the hypocotyl, below them, becomes the stem; the radicle is the embryonic root.</w:t>
-      </w:r>
-    </w:p>
-    <w:p>
-      <w:pPr>
-        <w:pStyle w:val="Guidetext"/>
-      </w:pPr>
-      <w:r>
-        <w:rPr/>
-        <w:t>Monocot vs eudicot seeds (27.2.25, 27.2.26): a monocot has one cotyledon, which stores some nutrients, absorbs others from the endosperm and passes them to the embryo; eudicot cotyledons store all the nutrients the embryo needs.</w:t>
-      </w:r>
-    </w:p>
-    <w:p>
-      <w:pPr>
-        <w:pStyle w:val="Guidepart"/>
-      </w:pPr>
-      <w:bookmarkStart w:id="28" w:name="g273"/>
-      <w:r>
-        <w:rPr>
-          <w:rStyle w:val="Slidecode"/>
-        </w:rPr>
-        <w:t>27.3 Fruit Types and Seed Dispersal</w:t>
-      </w:r>
-      <w:r>
-        <w:rPr/>
-        <w:t xml:space="preserve"> (slides 27–35)</w:t>
-      </w:r>
-      <w:bookmarkEnd w:id="28"/>
-    </w:p>
-    <w:p>
-      <w:pPr>
-        <w:pStyle w:val="Guidetext"/>
-      </w:pPr>
-      <w:r>
-        <w:rPr/>
-        <w:t>A fruit is a mature ovary (27.3.27). Simple fruits come from a single ovary; aggregate fruits from many ovaries of one flower (blackberry); multiple fruits from the ovaries of many flowers (pineapple) (27.3.27).</w:t>
-      </w:r>
-    </w:p>
-    <w:p>
-      <w:pPr>
-        <w:pStyle w:val="Guidetext"/>
-      </w:pPr>
-      <w:r>
-        <w:rPr/>
-        <w:t>The ovary wall becomes the pericarp, with up to three layers: exocarp (the skin), mesocarp (the flesh) and endocarp (around the seed) (27.3.28). Dry fruits either split open when ripe (dehiscent: legumes) or stay closed (indehiscent: grains) (27.3.29). Named fruit types include drupe, berry, legume and samara (27.3.30).</w:t>
-      </w:r>
-    </w:p>
-    <w:p>
-      <w:pPr>
-        <w:pStyle w:val="Guidetext"/>
-      </w:pPr>
-      <w:r>
-        <w:rPr/>
-        <w:t>Fruits help spread seeds: by wind (hairs, plumes, wings), by animals that eat the fruit, and by hooks and spines that catch on fur and clothing (27.3.31, 27.3.32).</w:t>
-      </w:r>
-    </w:p>
-    <w:p>
-      <w:pPr>
-        <w:pStyle w:val="Guidetext"/>
-      </w:pPr>
-      <w:r>
-        <w:rPr/>
-        <w:t>Germination (27.3.33, 27.3.34, 27.3.35): the embryo resumes growth. Some seeds must go through a dormant period first; in temperate zones cold weather breaks dormancy, and fleshy fruits contain inhibitors so seeds don't sprout on the plant. A seed needs oxygen, warmth and water. In corn, a sheath called the coleoptile covers the first leaf as it grows up.</w:t>
-      </w:r>
-    </w:p>
-    <w:p>
-      <w:pPr>
-        <w:pStyle w:val="Guidepart"/>
-      </w:pPr>
-      <w:bookmarkStart w:id="29" w:name="g274"/>
-      <w:r>
-        <w:rPr>
-          <w:rStyle w:val="Slidecode"/>
-        </w:rPr>
-        <w:t>27.4 Asexual Reproductive Strategies</w:t>
-      </w:r>
-      <w:r>
-        <w:rPr/>
-        <w:t xml:space="preserve"> (slides 36–41)</w:t>
-      </w:r>
-      <w:bookmarkEnd w:id="29"/>
-    </w:p>
-    <w:p>
-      <w:pPr>
-        <w:pStyle w:val="Guidetext"/>
-      </w:pPr>
-      <w:r>
-        <w:rPr/>
-        <w:t>Asexual reproduction makes clones, genetically identical copies. Plants use stolons (horizontal stems above ground), rhizomes (underground stems) and tubers; new growth starts at the nodes of stems, and a potato's "eyes" are buds (27.4.36, 27.4.37).</w:t>
-      </w:r>
-    </w:p>
-    <w:p>
-      <w:pPr>
-        <w:pStyle w:val="Guidetext"/>
-      </w:pPr>
-      <w:r>
-        <w:rPr/>
-        <w:t>Tissue culture grows a plant tissue on an artificial medium. It works because many plant cells are totipotent: each can become an entire plant (27.4.38). Meristem tissue on a medium with auxin, cytokinins and nutrients first forms an undifferentiated callus, then organs, then plantlets, all clones (27.4.39, 27.4.40). In cell suspension culture, cells grow in liquid to make chemicals, such as heart drugs from Digitalis (27.4.40).</w:t>
-      </w:r>
-    </w:p>
-    <w:p>
-      <w:pPr>
-        <w:pStyle w:val="Guidetext"/>
-      </w:pPr>
-      <w:r>
-        <w:rPr/>
-        <w:t>Traps: pollination vs fertilization; microspore vs megaspore; epicotyl vs hypocotyl vs radicle; aggregate vs multiple fruit; dehiscent vs indehiscent (27.1.15, 27.1.17, 27.2.22, 27.3.27, 27.3.29).</w:t>
-      </w:r>
-    </w:p>
-    <w:p>
-      <w:pPr>
-        <w:pStyle w:val="Guidepart"/>
-      </w:pPr>
-      <w:bookmarkStart w:id="30" w:name="g279"/>
-      <w:r>
-        <w:rPr/>
-        <w:t>Look these up, don't memorize</w:t>
-      </w:r>
-      <w:bookmarkEnd w:id="30"/>
+        <w:t>3. Negative mineral ions such as nitrate (NO3-) and phosphate (HPO4 2-) come in together with H+ through carrier proteins; this needs no extra energy, because H+ is moving down its gradient (25.2.21, 25.2.23).</w:t>
+      </w:r>
     </w:p>
     <w:p>
       <w:pPr>
@@ -2447,8 +1978,144 @@
       </w:pPr>
       <w:r>
         <w:rPr/>
-        <w:t>The cells of the embryo sac and the steps of each gametophyte: the gametophyte table.</w:t>
-      </w:r>
+        <w:t>Using a gradient this way is chemiosmosis. The minerals then move into the xylem and up to the leaves (25.2.21).</w:t>
+      </w:r>
+    </w:p>
+    <w:p>
+      <w:pPr>
+        <w:pStyle w:val="Guidetext"/>
+      </w:pPr>
+      <w:r>
+        <w:rPr/>
+        <w:t>Mutualisms for nutrients (25.2.24, 25.2.25, 25.2.26): Rhizobium bacteria in root nodules fix atmospheric nitrogen, and the host plant gives them carbohydrates. In mycorrhizae, the fungus increases the surface area for water and mineral uptake and breaks down organic matter, and the root gives the fungus sugars and amino acids; plants with mycorrhizae grow better.</w:t>
+      </w:r>
+    </w:p>
+    <w:p>
+      <w:pPr>
+        <w:pStyle w:val="Guidetext"/>
+      </w:pPr>
+      <w:r>
+        <w:rPr/>
+        <w:t>Other ways to get nutrients (25.2.24, 25.2.27): parasitic plants such as dodder wrap around a host plant and tap its xylem and phloem through root-like projections (haustoria, textbook); carnivorous plants such as the sundew trap prey on sticky hairs that release digestive enzymes.</w:t>
+      </w:r>
+    </w:p>
+    <w:p>
+      <w:pPr>
+        <w:pStyle w:val="Guidetext"/>
+      </w:pPr>
+      <w:r>
+        <w:rPr/>
+        <w:t>Traps: proton pump (H+ out, uses ATP) vs channel protein (K+ in) vs carrier protein (negative ions in with H+); nodules (bacteria, nitrogen) vs mycorrhizae (fungus, surface area); water enters passively vs minerals actively (25.2.20, 25.2.21, 25.2.24).</w:t>
+      </w:r>
+    </w:p>
+    <w:p>
+      <w:pPr>
+        <w:pStyle w:val="Guidepart"/>
+      </w:pPr>
+      <w:bookmarkStart w:id="18" w:name="g253"/>
+      <w:r>
+        <w:rPr>
+          <w:rStyle w:val="Slidecode"/>
+        </w:rPr>
+        <w:t>25.3 Transport Mechanisms in Plants</w:t>
+      </w:r>
+      <w:r>
+        <w:rPr/>
+        <w:t xml:space="preserve"> (slides 28–48)</w:t>
+      </w:r>
+      <w:bookmarkEnd w:id="18"/>
+    </w:p>
+    <w:p>
+      <w:pPr>
+        <w:pStyle w:val="Guidetext"/>
+      </w:pPr>
+      <w:r>
+        <w:rPr/>
+        <w:t>Xylem carries water and minerals from the bottom of the plant to the top, through tracheids and vessel elements. Phloem carries sucrose and other organic materials in any direction, through sieve-tube members, whose end walls are sieve plates crossed by plasmodesmata; companion cells supply them with proteins (25.3.28, 25.3.29, 25.3.30).</w:t>
+      </w:r>
+    </w:p>
+    <w:p>
+      <w:pPr>
+        <w:pStyle w:val="Guidetext"/>
+      </w:pPr>
+      <w:r>
+        <w:rPr/>
+        <w:t>Water potential is the energy of water; water always moves passively from higher to lower water potential (25.3.31). Two things set it (25.3.33): pressure (the higher the pressure, the higher the water potential) and solutes (the more solute, the lower the water potential, so water moves toward the side with more solute). Water potential falls from soil to root to stem to leaf, so water flows that way (25.3.32).</w:t>
+      </w:r>
+    </w:p>
+    <w:p>
+      <w:pPr>
+        <w:pStyle w:val="Guidetext"/>
+      </w:pPr>
+      <w:r>
+        <w:rPr/>
+        <w:t>Turgor pressure is the pressure that builds up inside a cell as water enters by osmosis. Turgid cells keep the plant firm; a wilted plant's cells have lost turgor, and water flows back in until the water potential is equal inside and out (25.3.33, 25.3.34).</w:t>
+      </w:r>
+    </w:p>
+    <w:p>
+      <w:pPr>
+        <w:pStyle w:val="Guidetext"/>
+      </w:pPr>
+      <w:r>
+        <w:rPr/>
+        <w:t>Root pressure: minerals concentrated in the root draw water in, creating a positive pressure that pushes xylem sap upward. It can force water droplets out of vein endings along leaf edges, which is guttation (25.3.35, 25.3.36). Root pressure alone can't lift water to the top of a tall tree (textbook).</w:t>
+      </w:r>
+    </w:p>
+    <w:p>
+      <w:pPr>
+        <w:pStyle w:val="Guidetext"/>
+      </w:pPr>
+      <w:r>
+        <w:rPr/>
+        <w:t>The cohesion-tension model (25.3.37, 25.3.38, 25.3.39) explains how water rises, passively, all the way up. Transpiration, water evaporating from the leaves through the stomata, creates tension that pulls on the water in the xylem. Cohesion, water molecules clinging to each other by hydrogen bonds, keeps the column unbroken from leaf to root, and adhesion, water sticking to the vessel walls, holds it in place. Water lost in the leaf is replaced from the leaf veins, the stem's column is pulled upward, and water enters the root xylem by osmosis. Transpired water rises as mist over forests (25.3.40).</w:t>
+      </w:r>
+    </w:p>
+    <w:p>
+      <w:pPr>
+        <w:pStyle w:val="Guidetext"/>
+      </w:pPr>
+      <w:r>
+        <w:rPr/>
+        <w:t>Stomata (25.3.41, 25.3.42): each stoma is bordered by two guard cells. To open, K+ is actively transported into the guard cells (H+ is pumped out, so H+ builds up outside), water follows by osmosis, turgor rises and the stoma opens. When K+ and then water leave, the stoma closes. Light regulates them, and ABA (abscisic acid) can close them. While stomata are closed, the waxy cuticle prevents water loss (25.3.39), but carbon dioxide can't enter, so photosynthesis slows (textbook).</w:t>
+      </w:r>
+    </w:p>
+    <w:p>
+      <w:pPr>
+        <w:pStyle w:val="Guidetext"/>
+      </w:pPr>
+      <w:r>
+        <w:rPr/>
+        <w:t>Phloem moves sap from source to sink (25.3.43, 25.3.44): a source is where sugar is made or comes from (older leaves); a sink is where it's unloaded (roots, young leaves). Evidence: girdling a tree below the leaves makes the bark swell just above the cut, where sugar accumulates; radioactive tracers confirm that phloem carries organic nutrients; and aphids, whose mouthparts tap the sieve tubes, are used to collect phloem sap (25.3.43, 25.3.48).</w:t>
+      </w:r>
+    </w:p>
+    <w:p>
+      <w:pPr>
+        <w:pStyle w:val="Guidetext"/>
+      </w:pPr>
+      <w:r>
+        <w:rPr/>
+        <w:t>The pressure-flow model (25.3.45, 25.3.46, 25.3.47): at the source, an ATP-driven pump pushes H+ out, and sucrose is loaded into the sieve tubes together with H+ (co-transport). Water follows by osmosis, creating high positive pressure, which pushes the sap toward the sink. At the sink, sugar is unloaded and used for cellular respiration or stored, and the water returns to the xylem.</w:t>
+      </w:r>
+    </w:p>
+    <w:p>
+      <w:pPr>
+        <w:pStyle w:val="Guidetext"/>
+      </w:pPr>
+      <w:r>
+        <w:rPr/>
+        <w:t>Traps: cohesion (water to water) vs adhesion (water to walls); transpiration (pull from the top) vs root pressure (push from below); xylem (one way, up, pulled, no energy) vs phloem (any direction, pushed, active loading); source vs sink; stomata open when K+ enters, close when it leaves (25.3.29, 25.3.35, 25.3.37, 25.3.41, 25.3.43).</w:t>
+      </w:r>
+    </w:p>
+    <w:p>
+      <w:pPr>
+        <w:pStyle w:val="Guidepart"/>
+      </w:pPr>
+      <w:bookmarkStart w:id="19" w:name="g259"/>
+      <w:r>
+        <w:rPr/>
+        <w:t>Look these up, don't memorize</w:t>
+      </w:r>
+      <w:bookmarkEnd w:id="19"/>
     </w:p>
     <w:p>
       <w:pPr>
@@ -2460,7 +2127,7 @@
       </w:pPr>
       <w:r>
         <w:rPr/>
-        <w:t>Fruit types and examples: the fruit table.</w:t>
+        <w:t>Macronutrients and micronutrients: the nutrients table (with N added).</w:t>
       </w:r>
     </w:p>
     <w:p>
@@ -2473,7 +2140,7 @@
       </w:pPr>
       <w:r>
         <w:rPr/>
-        <w:t>Pollinators and their flowers: the pollinator table.</w:t>
+        <w:t>Soil particles, horizons and what humus does: the soil tables.</w:t>
       </w:r>
     </w:p>
     <w:p>
@@ -2486,7 +2153,1376 @@
       </w:pPr>
       <w:r>
         <w:rPr/>
-        <w:t>Germination steps for bean and corn: 27.3.35.</w:t>
+        <w:t>The three steps of mineral uptake, stomata opening and closing, cohesion-tension and pressure-flow: the sequences.</w:t>
+      </w:r>
+    </w:p>
+    <w:p>
+      <w:pPr>
+        <w:pStyle w:val="Guidebullet"/>
+        <w:numPr>
+          <w:ilvl w:val="0"/>
+          <w:numId w:val="90"/>
+        </w:numPr>
+      </w:pPr>
+      <w:r>
+        <w:rPr/>
+        <w:t>Xylem vs phloem: the comparison table.</w:t>
+      </w:r>
+    </w:p>
+    <w:p>
+      <w:pPr>
+        <w:pStyle w:val="Guidebullet"/>
+        <w:numPr>
+          <w:ilvl w:val="0"/>
+          <w:numId w:val="90"/>
+        </w:numPr>
+      </w:pPr>
+      <w:r>
+        <w:rPr/>
+        <w:t>Exact numbers (particle sizes, 10-20% humus, 10,000 times, erosion statistics): don't memorize them.</w:t>
+      </w:r>
+    </w:p>
+    <w:p>
+      <w:pPr>
+        <w:pStyle w:val="Chapterheading"/>
+      </w:pPr>
+      <w:r>
+        <w:rPr>
+          <w:rStyle w:val="Slidecode"/>
+        </w:rPr>
+        <w:t>Chapter 26: Flowering Plants: Control of Growth Responses</w:t>
+      </w:r>
+    </w:p>
+    <w:p>
+      <w:pPr>
+        <w:pStyle w:val="Guideheading"/>
+      </w:pPr>
+      <w:bookmarkStart w:id="20" w:name="g260"/>
+      <w:r>
+        <w:rPr>
+          <w:rStyle w:val="Slidecode"/>
+        </w:rPr>
+        <w:t>Quick guide: the big picture</w:t>
+      </w:r>
+      <w:bookmarkEnd w:id="20"/>
+    </w:p>
+    <w:p>
+      <w:pPr>
+        <w:pStyle w:val="Guidetext"/>
+      </w:pPr>
+      <w:r>
+        <w:rPr/>
+        <w:t>Plants can't move away from danger or toward food, so they respond to their surroundings mostly by changing how they grow (26.1.3). Ch 26 has three parts: the hormones that carry signals around the plant (26.1), growth and movement responses to light, gravity and touch (26.2), and phytochrome, the pigment that lets plants track day and night length (26.3).</w:t>
+      </w:r>
+    </w:p>
+    <w:p>
+      <w:pPr>
+        <w:pStyle w:val="Guidetext"/>
+      </w:pPr>
+      <w:r>
+        <w:rPr/>
+        <w:t>One pattern repeats throughout: a stimulus is detected by a receptor, the signal is passed along and amplified inside the cell, and the cell responds, often by changing which genes are turned on (26.1.4, 26.1.5).</w:t>
+      </w:r>
+    </w:p>
+    <w:p>
+      <w:pPr>
+        <w:pStyle w:val="Guidepart"/>
+      </w:pPr>
+      <w:bookmarkStart w:id="21" w:name="g261"/>
+      <w:r>
+        <w:rPr>
+          <w:rStyle w:val="Slidecode"/>
+        </w:rPr>
+        <w:t>26.1 Plant Hormones</w:t>
+      </w:r>
+      <w:r>
+        <w:rPr/>
+        <w:t xml:space="preserve"> (slides 3–23)</w:t>
+      </w:r>
+      <w:bookmarkEnd w:id="21"/>
+    </w:p>
+    <w:p>
+      <w:pPr>
+        <w:pStyle w:val="Guidetext"/>
+      </w:pPr>
+      <w:r>
+        <w:rPr/>
+        <w:t>Plants respond to stimuli such as light, gravity, carbon dioxide levels, pathogen infection, drought and touch, and responding helps the species survive. Responses can be short-term, like stomata opening and closing with light levels, or long-term, like roots growing down and stems growing up in response to gravity (26.1.3).</w:t>
+      </w:r>
+    </w:p>
+    <w:p>
+      <w:pPr>
+        <w:pStyle w:val="Guidetext"/>
+      </w:pPr>
+      <w:r>
+        <w:rPr/>
+        <w:t>Signal transduction (26.1.4, 26.1.5): a receptor, a protein in the plasma membrane, cytoplasm or nucleus, is activated by a specific signal (for example, blue light); a transduction pathway of relay proteins or enzymes amplifies the signal and converts it into one the cell's machinery understands; the cellular response follows, most often a change in gene expression (for example, a stem bending or roots growing).</w:t>
+      </w:r>
+    </w:p>
+    <w:p>
+      <w:pPr>
+        <w:pStyle w:val="Guidetext"/>
+      </w:pPr>
+      <w:r>
+        <w:rPr/>
+        <w:t>Hormones are chemical signals that let plant cells communicate and coordinate their responses. Each is made in one part of the plant and travels in the phloem or from cell to cell (26.1.6). There are five main ones (26.1.7).</w:t>
+      </w:r>
+    </w:p>
+    <w:p>
+      <w:pPr>
+        <w:pStyle w:val="Guidesubheading"/>
+      </w:pPr>
+      <w:r>
+        <w:rPr/>
+        <w:t>Auxin (26.1.8 to 26.1.11)</w:t>
+      </w:r>
+    </w:p>
+    <w:p>
+      <w:pPr>
+        <w:pStyle w:val="Guidebullet"/>
+        <w:numPr>
+          <w:ilvl w:val="0"/>
+          <w:numId w:val="90"/>
+        </w:numPr>
+      </w:pPr>
+      <w:r>
+        <w:rPr/>
+        <w:t>Made in the shoot apical meristem; found in young leaves, flowers and fruits (26.1.8).</w:t>
+      </w:r>
+    </w:p>
+    <w:p>
+      <w:pPr>
+        <w:pStyle w:val="Guidebullet"/>
+        <w:numPr>
+          <w:ilvl w:val="0"/>
+          <w:numId w:val="90"/>
+        </w:numPr>
+      </w:pPr>
+      <w:r>
+        <w:rPr/>
+        <w:t>Apical dominance: auxin from the shoot tip prevents the axillary buds below from growing (26.1.8), which is why pruning the tip makes a plant bushier (textbook).</w:t>
+      </w:r>
+    </w:p>
+    <w:p>
+      <w:pPr>
+        <w:pStyle w:val="Guidebullet"/>
+        <w:numPr>
+          <w:ilvl w:val="0"/>
+          <w:numId w:val="90"/>
+        </w:numPr>
+      </w:pPr>
+      <w:r>
+        <w:rPr/>
+        <w:t>Promotes growth of roots and fruit, prevents loss of leaves and fruit, and makes stems bend toward light (positive phototropism) (26.1.8).</w:t>
+      </w:r>
+    </w:p>
+    <w:p>
+      <w:pPr>
+        <w:pStyle w:val="Guidebullet"/>
+        <w:numPr>
+          <w:ilvl w:val="0"/>
+          <w:numId w:val="90"/>
+        </w:numPr>
+      </w:pPr>
+      <w:r>
+        <w:rPr/>
+        <w:t>Discovery: auxin from a coleoptile tip (the sheath over a grass seedling's first leaves), collected in a block of agar and placed on one side of a cut seedling, makes it curve (26.1.9).</w:t>
+      </w:r>
+    </w:p>
+    <w:p>
+      <w:pPr>
+        <w:pStyle w:val="Guidebullet"/>
+        <w:numPr>
+          <w:ilvl w:val="0"/>
+          <w:numId w:val="90"/>
+        </w:numPr>
+      </w:pPr>
+      <w:r>
+        <w:rPr/>
+        <w:t>How it bends a stem (26.1.10, 26.1.11): with light from one side, auxin moves to the shady side; it binds receptors, which activates proton pumps; H+ pumped into the cell wall activates enzymes that break cellulose fibers and loosen the wall; water enters, turgor pressure rises, the cell enlarges and rebuilds a longer wall. Only the shady-side cells lengthen, so the stem bends toward the light.</w:t>
+      </w:r>
+    </w:p>
+    <w:p>
+      <w:pPr>
+        <w:pStyle w:val="Guidebullet"/>
+        <w:numPr>
+          <w:ilvl w:val="0"/>
+          <w:numId w:val="90"/>
+        </w:numPr>
+      </w:pPr>
+      <w:r>
+        <w:rPr/>
+        <w:t>Synthetic auxins are used as herbicides (2,4-D; Agent Orange defoliated forests in Vietnam), and auxin can make fruit form without pollination (26.1.7, 26.1.10).</w:t>
+      </w:r>
+    </w:p>
+    <w:p>
+      <w:pPr>
+        <w:pStyle w:val="Guidesubheading"/>
+      </w:pPr>
+      <w:r>
+        <w:rPr/>
+        <w:t>Gibberellins (26.1.12, 26.1.13)</w:t>
+      </w:r>
+    </w:p>
+    <w:p>
+      <w:pPr>
+        <w:pStyle w:val="Guidebullet"/>
+        <w:numPr>
+          <w:ilvl w:val="0"/>
+          <w:numId w:val="90"/>
+        </w:numPr>
+      </w:pPr>
+      <w:r>
+        <w:rPr/>
+        <w:t>Growth-promoting hormones that cause stem elongation; the most common is gibberellic acid (26.1.12).</w:t>
+      </w:r>
+    </w:p>
+    <w:p>
+      <w:pPr>
+        <w:pStyle w:val="Guidebullet"/>
+        <w:numPr>
+          <w:ilvl w:val="0"/>
+          <w:numId w:val="90"/>
+        </w:numPr>
+      </w:pPr>
+      <w:r>
+        <w:rPr/>
+        <w:t>They break the dormancy of buds and seeds; dormancy is a period when growth is suspended (26.1.12).</w:t>
+      </w:r>
+    </w:p>
+    <w:p>
+      <w:pPr>
+        <w:pStyle w:val="Guidebullet"/>
+        <w:numPr>
+          <w:ilvl w:val="0"/>
+          <w:numId w:val="90"/>
+        </w:numPr>
+      </w:pPr>
+      <w:r>
+        <w:rPr/>
+        <w:t>Commercial use: inducing growth in crops; treated plants grow taller and treated grapes grow larger (26.1.12, 26.1.13).</w:t>
+      </w:r>
+    </w:p>
+    <w:p>
+      <w:pPr>
+        <w:pStyle w:val="Guidesubheading"/>
+      </w:pPr>
+      <w:r>
+        <w:rPr/>
+        <w:t>Cytokinins (26.1.14 to 26.1.16)</w:t>
+      </w:r>
+    </w:p>
+    <w:p>
+      <w:pPr>
+        <w:pStyle w:val="Guidebullet"/>
+        <w:numPr>
+          <w:ilvl w:val="0"/>
+          <w:numId w:val="90"/>
+        </w:numPr>
+      </w:pPr>
+      <w:r>
+        <w:rPr/>
+        <w:t>Promote cell division and organ formation; found in dividing root tissue, seeds and fruits (26.1.14).</w:t>
+      </w:r>
+    </w:p>
+    <w:p>
+      <w:pPr>
+        <w:pStyle w:val="Guidebullet"/>
+        <w:numPr>
+          <w:ilvl w:val="0"/>
+          <w:numId w:val="90"/>
+        </w:numPr>
+      </w:pPr>
+      <w:r>
+        <w:rPr/>
+        <w:t>Responsible for root nodules (which house nitrogen-fixing bacteria) and galls on wounded trees (26.1.14).</w:t>
+      </w:r>
+    </w:p>
+    <w:p>
+      <w:pPr>
+        <w:pStyle w:val="Guidebullet"/>
+        <w:numPr>
+          <w:ilvl w:val="0"/>
+          <w:numId w:val="90"/>
+        </w:numPr>
+      </w:pPr>
+      <w:r>
+        <w:rPr/>
+        <w:t>Together with auxin, prevent senescence (aging); in autumn, low cytokinin levels let leaves change color and die; used to prolong the life of cut flowers and stored vegetables (26.1.14, 26.1.16).</w:t>
+      </w:r>
+    </w:p>
+    <w:p>
+      <w:pPr>
+        <w:pStyle w:val="Guidebullet"/>
+        <w:numPr>
+          <w:ilvl w:val="0"/>
+          <w:numId w:val="90"/>
+        </w:numPr>
+      </w:pPr>
+      <w:r>
+        <w:rPr/>
+        <w:t>In tissue culture, the ratio of auxin to cytokinin decides what forms: an undifferentiated callus, roots, leafy shoots or flowers (26.1.15; textbook).</w:t>
+      </w:r>
+    </w:p>
+    <w:p>
+      <w:pPr>
+        <w:pStyle w:val="Guidesubheading"/>
+      </w:pPr>
+      <w:r>
+        <w:rPr/>
+        <w:t>Abscisic acid, ABA (26.1.17 to 26.1.19)</w:t>
+      </w:r>
+    </w:p>
+    <w:p>
+      <w:pPr>
+        <w:pStyle w:val="Guidebullet"/>
+        <w:numPr>
+          <w:ilvl w:val="0"/>
+          <w:numId w:val="90"/>
+        </w:numPr>
+      </w:pPr>
+      <w:r>
+        <w:rPr/>
+        <w:t>Produced by any green tissue; called the stress hormone (26.1.17).</w:t>
+      </w:r>
+    </w:p>
+    <w:p>
+      <w:pPr>
+        <w:pStyle w:val="Guidebullet"/>
+        <w:numPr>
+          <w:ilvl w:val="0"/>
+          <w:numId w:val="90"/>
+        </w:numPr>
+      </w:pPr>
+      <w:r>
+        <w:rPr/>
+        <w:t>Starts and maintains seed and bud dormancy; corn that can't respond to ABA shows vivipary, sprouting while still on the cob (26.1.17, 26.1.18).</w:t>
+      </w:r>
+    </w:p>
+    <w:p>
+      <w:pPr>
+        <w:pStyle w:val="Guidebullet"/>
+        <w:numPr>
+          <w:ilvl w:val="0"/>
+          <w:numId w:val="90"/>
+        </w:numPr>
+      </w:pPr>
+      <w:r>
+        <w:rPr/>
+        <w:t>Closes stomata (26.1.17, 26.1.19). How (textbook): ABA binds a receptor on the guard cell, calcium ions enter as a second messenger, K+ channels open, K+ and then water leave, and the stoma closes.</w:t>
+      </w:r>
+    </w:p>
+    <w:p>
+      <w:pPr>
+        <w:pStyle w:val="Guidebullet"/>
+        <w:numPr>
+          <w:ilvl w:val="0"/>
+          <w:numId w:val="90"/>
+        </w:numPr>
+      </w:pPr>
+      <w:r>
+        <w:rPr/>
+        <w:t>Commercial use: thinning fruit so the remaining fruit grows larger (26.1.7).</w:t>
+      </w:r>
+    </w:p>
+    <w:p>
+      <w:pPr>
+        <w:pStyle w:val="Guidesubheading"/>
+      </w:pPr>
+      <w:r>
+        <w:rPr/>
+        <w:t>Ethylene (26.1.20 to 26.1.22)</w:t>
+      </w:r>
+    </w:p>
+    <w:p>
+      <w:pPr>
+        <w:pStyle w:val="Guidebullet"/>
+        <w:numPr>
+          <w:ilvl w:val="0"/>
+          <w:numId w:val="90"/>
+        </w:numPr>
+      </w:pPr>
+      <w:r>
+        <w:rPr/>
+        <w:t>A gas formed from the amino acid methionine (26.1.20).</w:t>
+      </w:r>
+    </w:p>
+    <w:p>
+      <w:pPr>
+        <w:pStyle w:val="Guidebullet"/>
+        <w:numPr>
+          <w:ilvl w:val="0"/>
+          <w:numId w:val="90"/>
+        </w:numPr>
+      </w:pPr>
+      <w:r>
+        <w:rPr/>
+        <w:t>Causes abscission, the dropping of leaves, fruit or flowers, by stimulating enzymes such as cellulase; a ripe apple under a jar makes a holly twig drop its leaves (26.1.20, 26.1.21).</w:t>
+      </w:r>
+    </w:p>
+    <w:p>
+      <w:pPr>
+        <w:pStyle w:val="Guidebullet"/>
+        <w:numPr>
+          <w:ilvl w:val="0"/>
+          <w:numId w:val="90"/>
+        </w:numPr>
+      </w:pPr>
+      <w:r>
+        <w:rPr/>
+        <w:t>Ripens fruit, by activating enzymes that soften it and produce its flavor and smell; tomatoes engineered not to make ethylene are harvested green (26.1.20, 26.1.22).</w:t>
+      </w:r>
+    </w:p>
+    <w:p>
+      <w:pPr>
+        <w:pStyle w:val="Guidebullet"/>
+        <w:numPr>
+          <w:ilvl w:val="0"/>
+          <w:numId w:val="90"/>
+        </w:numPr>
+      </w:pPr>
+      <w:r>
+        <w:rPr/>
+        <w:t>Also inhibits axillary buds and suppresses stem and root elongation (26.1.20).</w:t>
+      </w:r>
+    </w:p>
+    <w:p>
+      <w:pPr>
+        <w:pStyle w:val="Guidetext"/>
+      </w:pPr>
+      <w:r>
+        <w:rPr/>
+        <w:t>Hormones mainly handle abiotic stimuli (light, oxygen, water, pH, temperature). Against biotic threats (herbivores, parasites, competing plants), plants rely on their epidermis and bark and on secondary metabolites, defense chemicals once thought to be waste products. Primary metabolites, such as sugars and amino acids, are the ones every cell needs to work normally (26.1.23).</w:t>
+      </w:r>
+    </w:p>
+    <w:p>
+      <w:pPr>
+        <w:pStyle w:val="Guidetext"/>
+      </w:pPr>
+      <w:r>
+        <w:rPr/>
+        <w:t>Traps: abscisic acid vs abscission (the ABA slide defines abscission, but ethylene causes it; the textbook says ABA no longer counts as its natural cause); gibberellins (break dormancy) vs ABA (keeps dormancy); auxin (apical dominance, elongation) vs cytokinins (cell division); primary vs secondary metabolites (26.1.12, 26.1.17, 26.1.20, 26.1.23).</w:t>
+      </w:r>
+    </w:p>
+    <w:p>
+      <w:pPr>
+        <w:pStyle w:val="Guidepart"/>
+      </w:pPr>
+      <w:bookmarkStart w:id="22" w:name="g262"/>
+      <w:r>
+        <w:rPr>
+          <w:rStyle w:val="Slidecode"/>
+        </w:rPr>
+        <w:t>26.2 Plant Growth and Movement Responses</w:t>
+      </w:r>
+      <w:r>
+        <w:rPr/>
+        <w:t xml:space="preserve"> (slides 24–35)</w:t>
+      </w:r>
+      <w:bookmarkEnd w:id="22"/>
+    </w:p>
+    <w:p>
+      <w:pPr>
+        <w:pStyle w:val="Guidetext"/>
+      </w:pPr>
+      <w:r>
+        <w:rPr/>
+        <w:t>A tropism is plant growth toward or away from a stimulus that comes from one direction: positive tropism is growth toward it, negative tropism is growth away (26.2.24). It happens because one side of the organ grows faster than the other (textbook).</w:t>
+      </w:r>
+    </w:p>
+    <w:p>
+      <w:pPr>
+        <w:pStyle w:val="Guidesubheading"/>
+      </w:pPr>
+      <w:r>
+        <w:rPr/>
+        <w:t>The three tropisms</w:t>
+      </w:r>
+    </w:p>
+    <w:p>
+      <w:pPr>
+        <w:pStyle w:val="Guidebullet"/>
+        <w:numPr>
+          <w:ilvl w:val="0"/>
+          <w:numId w:val="90"/>
+        </w:numPr>
+      </w:pPr>
+      <w:r>
+        <w:rPr/>
+        <w:t>Phototropism (light): stems bend toward light because auxin makes the cells on the shady side elongate. The receptor pigment phototropin absorbs blue light, becomes phosphorylated and starts the transduction pathway that moves auxin. Roots are insensitive to light or grow away from it (26.2.25, 26.2.26).</w:t>
+      </w:r>
+    </w:p>
+    <w:p>
+      <w:pPr>
+        <w:pStyle w:val="Guidebullet"/>
+        <w:numPr>
+          <w:ilvl w:val="0"/>
+          <w:numId w:val="90"/>
+        </w:numPr>
+      </w:pPr>
+      <w:r>
+        <w:rPr/>
+        <w:t>Thigmotropism (touch from another plant, an animal, a rock or wind): stems and tendrils of runner beans and morning glories coil around a support. Thigmomorphogenesis is a change in the plant's overall shape due to touch, such as a barrier, wind or rain (26.2.27, 26.2.28); wind-blown plants grow shorter and sturdier (textbook).</w:t>
+      </w:r>
+    </w:p>
+    <w:p>
+      <w:pPr>
+        <w:pStyle w:val="Guidebullet"/>
+        <w:numPr>
+          <w:ilvl w:val="0"/>
+          <w:numId w:val="90"/>
+        </w:numPr>
+      </w:pPr>
+      <w:r>
+        <w:rPr/>
+        <w:t>Gravitropism (gravity): a plant laid on its side grows its stem upward and its roots downward. Roots sense gravity with statoliths, starch grains inside organelles called amyloplasts in root-cap cells, which settle to the bottom of each cell and signal the downward direction; auxin may then direct the bending (26.2.29, 26.2.30). A clinostat keeps a plant turning so statoliths can't settle (26.2.30). The slide's "stems with root caps grow downward" should say roots (26.2.29).</w:t>
+      </w:r>
+    </w:p>
+    <w:p>
+      <w:pPr>
+        <w:pStyle w:val="Guidetext"/>
+      </w:pPr>
+      <w:r>
+        <w:rPr/>
+        <w:t>Arabidopsis thaliana, a small flowering plant related to cabbage and mustard with no commercial value, is the model organism for plant molecular genetics, including signal transduction: it's small, matures in 5 to 6 weeks, normally self-pollinates but is easily cross-pollinated, and has relatively few base pairs of DNA (26.2.31, 26.2.32).</w:t>
+      </w:r>
+    </w:p>
+    <w:p>
+      <w:pPr>
+        <w:pStyle w:val="Guidetext"/>
+      </w:pPr>
+      <w:r>
+        <w:rPr/>
+        <w:t>Turgor movements, also called nastic movements, are caused by internal stimuli: they don't involve growth and don't depend on the direction of the stimulus. They come from electrical impulses, hormone action or changes in turgor pressure: a cell that fills with water is turgid, and one that loses water goes limp (26.2.33, 26.2.34).</w:t>
+      </w:r>
+    </w:p>
+    <w:p>
+      <w:pPr>
+        <w:pStyle w:val="Guidetext"/>
+      </w:pPr>
+      <w:r>
+        <w:rPr/>
+        <w:t>Examples (26.2.33, 26.2.35): touching Mimosa pudica (the sensitive plant) makes its leaflets collapse within a second, because cells in the leaf petiole lose turgor pressure; the Venus flytrap snaps shut when touched; and sleep movements, leaves folding daily with light and dark, follow a circadian rhythm.</w:t>
+      </w:r>
+    </w:p>
+    <w:p>
+      <w:pPr>
+        <w:pStyle w:val="Guidetext"/>
+      </w:pPr>
+      <w:r>
+        <w:rPr/>
+        <w:t>Traps: tropism (growth, directional) vs turgor movement (no growth, not directional); positive vs negative tropism; phototropin (blue light, phototropism) vs phytochrome (red and far-red, photoperiod) (26.2.24, 26.2.25, 26.2.33, 26.3.37).</w:t>
+      </w:r>
+    </w:p>
+    <w:p>
+      <w:pPr>
+        <w:pStyle w:val="Guidepart"/>
+      </w:pPr>
+      <w:bookmarkStart w:id="23" w:name="g263"/>
+      <w:r>
+        <w:rPr>
+          <w:rStyle w:val="Slidecode"/>
+        </w:rPr>
+        <w:t>26.3 Plant Responses to Phytochrome</w:t>
+      </w:r>
+      <w:r>
+        <w:rPr/>
+        <w:t xml:space="preserve"> (slides 36–46)</w:t>
+      </w:r>
+      <w:bookmarkEnd w:id="23"/>
+    </w:p>
+    <w:p>
+      <w:pPr>
+        <w:pStyle w:val="Guidetext"/>
+      </w:pPr>
+      <w:r>
+        <w:rPr/>
+        <w:t>Photoperiodism is any physiological response to changes in the length of day or night, such as when to flower. It requires a biological clock and the photoreceptor phytochrome (26.3.36).</w:t>
+      </w:r>
+    </w:p>
+    <w:p>
+      <w:pPr>
+        <w:pStyle w:val="Guidetext"/>
+      </w:pPr>
+      <w:r>
+        <w:rPr/>
+        <w:t>Phytochrome is a blue-green leaf pigment with two forms (26.3.37, 26.3.38, 26.3.39). Pr (phytochrome red), the inactive form, absorbs red light, which is plentiful in daylight, and turns into Pfr, the active form. Pfr absorbs far-red light and turns back into Pr in the evening, and whenever light is limited (shade, night). Switching between the two lets the plant detect photoperiod changes. Phytochrome also promotes seed germination and flowering and inhibits shoot elongation (26.3.37).</w:t>
+      </w:r>
+    </w:p>
+    <w:p>
+      <w:pPr>
+        <w:pStyle w:val="Guidetext"/>
+      </w:pPr>
+      <w:r>
+        <w:rPr/>
+        <w:t>Flowering (26.3.40, 26.3.41, 26.3.42): short-day plants flower when the day is shorter than a critical length; long-day plants, such as clover, flower when it is longer; day-neutral plants flower regardless of day length. What really counts is night length: a flash of light in the middle of the long night stops a short-day plant from flowering but makes a long-day plant flower. So short-day plants are long-night plants, and long-day plants are short-night plants.</w:t>
+      </w:r>
+    </w:p>
+    <w:p>
+      <w:pPr>
+        <w:pStyle w:val="Guidetext"/>
+      </w:pPr>
+      <w:r>
+        <w:rPr/>
+        <w:t>Shade and spacing (26.3.43, 26.3.44): leaf shade increases far-red light relative to red light, and plants measure the far-red light bounced back by neighboring plants; the more far-red they sense, the more energy they spend growing taller to outcompete the others for sunlight. Seedlings grown in darkness are etiolated: the shoot keeps elongating, and the leaves stay small and yellow (26.3.43; textbook).</w:t>
+      </w:r>
+    </w:p>
+    <w:p>
+      <w:pPr>
+        <w:pStyle w:val="Guidetext"/>
+      </w:pPr>
+      <w:r>
+        <w:rPr/>
+        <w:t>Circadian rhythms are biological rhythms with a cycle of about 24 hours, such as sleep movements and flowers opening and closing (26.3.45, 26.3.46). They persist without outside cues because a biological clock runs them, but a plant kept in dim light shifts its sleep cycle (26.3.45). Entrainment means being synchronized to light at daybreak (26.3.45).</w:t>
+      </w:r>
+    </w:p>
+    <w:p>
+      <w:pPr>
+        <w:pStyle w:val="Guidetext"/>
+      </w:pPr>
+      <w:r>
+        <w:rPr/>
+        <w:t>Traps: Pr (inactive, absorbs red) vs Pfr (active, absorbs far-red); short-day means long-night; a night flash changes night length, not day length; photoperiodism (seasons) vs circadian rhythm (daily) (26.3.37, 26.3.41, 26.3.42, 26.3.45). The text alternative printed with 26.3.41 actually describes Mimosa's leaves (26.2.35).</w:t>
+      </w:r>
+    </w:p>
+    <w:p>
+      <w:pPr>
+        <w:pStyle w:val="Guidepart"/>
+      </w:pPr>
+      <w:bookmarkStart w:id="24" w:name="g269"/>
+      <w:r>
+        <w:rPr/>
+        <w:t>Look these up, don't memorize</w:t>
+      </w:r>
+      <w:bookmarkEnd w:id="24"/>
+    </w:p>
+    <w:p>
+      <w:pPr>
+        <w:pStyle w:val="Guidebullet"/>
+        <w:numPr>
+          <w:ilvl w:val="0"/>
+          <w:numId w:val="90"/>
+        </w:numPr>
+      </w:pPr>
+      <w:r>
+        <w:rPr/>
+        <w:t>Each hormone: where it's made, what it does, its commercial use: the hormone table.</w:t>
+      </w:r>
+    </w:p>
+    <w:p>
+      <w:pPr>
+        <w:pStyle w:val="Guidebullet"/>
+        <w:numPr>
+          <w:ilvl w:val="0"/>
+          <w:numId w:val="90"/>
+        </w:numPr>
+      </w:pPr>
+      <w:r>
+        <w:rPr/>
+        <w:t>Tropisms and turgor movements side by side: the movements table.</w:t>
+      </w:r>
+    </w:p>
+    <w:p>
+      <w:pPr>
+        <w:pStyle w:val="Guidebullet"/>
+        <w:numPr>
+          <w:ilvl w:val="0"/>
+          <w:numId w:val="90"/>
+        </w:numPr>
+      </w:pPr>
+      <w:r>
+        <w:rPr/>
+        <w:t>Short-day, long-day and day-neutral plants, and what a night flash does: the photoperiod table.</w:t>
+      </w:r>
+    </w:p>
+    <w:p>
+      <w:pPr>
+        <w:pStyle w:val="Guidebullet"/>
+        <w:numPr>
+          <w:ilvl w:val="0"/>
+          <w:numId w:val="90"/>
+        </w:numPr>
+      </w:pPr>
+      <w:r>
+        <w:rPr/>
+        <w:t>Exact numbers (136 gibberellins, Arabidopsis details): don't memorize them.</w:t>
+      </w:r>
+    </w:p>
+    <w:p>
+      <w:pPr>
+        <w:pStyle w:val="Chapterheading"/>
+      </w:pPr>
+      <w:r>
+        <w:rPr>
+          <w:rStyle w:val="Slidecode"/>
+        </w:rPr>
+        <w:t>Chapter 27: Flowering Plants: Reproduction</w:t>
+      </w:r>
+    </w:p>
+    <w:p>
+      <w:pPr>
+        <w:pStyle w:val="Guideheading"/>
+      </w:pPr>
+      <w:bookmarkStart w:id="25" w:name="g270"/>
+      <w:r>
+        <w:rPr>
+          <w:rStyle w:val="Slidecode"/>
+        </w:rPr>
+        <w:t>Quick guide: the big picture</w:t>
+      </w:r>
+      <w:bookmarkEnd w:id="25"/>
+    </w:p>
+    <w:p>
+      <w:pPr>
+        <w:pStyle w:val="Guidetext"/>
+      </w:pPr>
+      <w:r>
+        <w:rPr/>
+        <w:t>Ch 27 follows the flowering plant's life cycle in detail: how a flower makes pollen (the male gametophyte) and the embryo sac (the female gametophyte), pollination and double fertilization (27.1), how the embryo develops inside the seed (27.2), fruits, seed dispersal and germination (27.3), and reproduction without seeds (27.4).</w:t>
+      </w:r>
+    </w:p>
+    <w:p>
+      <w:pPr>
+        <w:pStyle w:val="Guidetext"/>
+      </w:pPr>
+      <w:r>
+        <w:rPr/>
+        <w:t>It builds on the Ch 23 life cycle. Keep two rules in mind: meiosis makes spores and mitosis makes gametes; after fertilization, the ovule becomes the seed and the ovary becomes the fruit (27.1.3, 27.1.5).</w:t>
+      </w:r>
+    </w:p>
+    <w:p>
+      <w:pPr>
+        <w:pStyle w:val="Guidepart"/>
+      </w:pPr>
+      <w:bookmarkStart w:id="26" w:name="g271"/>
+      <w:r>
+        <w:rPr>
+          <w:rStyle w:val="Slidecode"/>
+        </w:rPr>
+        <w:t>27.1 Sexual Reproductive Strategies</w:t>
+      </w:r>
+      <w:r>
+        <w:rPr/>
+        <w:t xml:space="preserve"> (slides 3–19)</w:t>
+      </w:r>
+      <w:bookmarkEnd w:id="26"/>
+    </w:p>
+    <w:p>
+      <w:pPr>
+        <w:pStyle w:val="Guidetext"/>
+      </w:pPr>
+      <w:r>
+        <w:rPr/>
+        <w:t>Plants have a two-stage, alternating life cycle (27.1.3). The diploid (2n) sporophyte is dominant; it is the plant you see and the stage that bears flowers. Its flowers make two kinds of haploid spores by meiosis: microspores (in anthers) and megaspores (in ovules). Each spore divides by mitosis into a haploid gametophyte, which makes gametes; gametes fuse into a diploid zygote, which grows by mitosis into a new sporophyte (27.1.3, 27.1.4).</w:t>
+      </w:r>
+    </w:p>
+    <w:p>
+      <w:pPr>
+        <w:pStyle w:val="Guidetext"/>
+      </w:pPr>
+      <w:r>
+        <w:rPr/>
+        <w:t>A microspore becomes the male gametophyte, the pollen grain; a megaspore becomes the female gametophyte, the embryo sac, inside an ovule inside an ovary. The ovule becomes a seed, and the ovary becomes a fruit (27.1.5). The slide's "Microspore – Male gametophyte" means a microspore becomes one; the spore itself isn't the gametophyte.</w:t>
+      </w:r>
+    </w:p>
+    <w:p>
+      <w:pPr>
+        <w:pStyle w:val="Guidetext"/>
+      </w:pPr>
+      <w:r>
+        <w:rPr/>
+        <w:t>The cycle suits life on land (textbook): the tiny gametophytes develop inside the sporophyte, protected from drying out; pollen has a tough wall; sperm reach the egg through a pollen tube, so no outside water is needed; and the seed coat protects the embryo until conditions favor germination.</w:t>
+      </w:r>
+    </w:p>
+    <w:p>
+      <w:pPr>
+        <w:pStyle w:val="Guidetext"/>
+      </w:pPr>
+      <w:r>
+        <w:rPr/>
+        <w:t>Flowers are unique to angiosperms: they attract pollinators and produce fruits that enclose seeds. Flowering often responds to signals such as day length: a meristem stops producing leaves and starts producing flowers. Monocot flower parts come in threes, eudicot parts in fours or fives (27.1.6, 27.1.9).</w:t>
+      </w:r>
+    </w:p>
+    <w:p>
+      <w:pPr>
+        <w:pStyle w:val="Guidesubheading"/>
+      </w:pPr>
+      <w:r>
+        <w:rPr/>
+        <w:t>Flower structure (27.1.7, 27.1.8)</w:t>
+      </w:r>
+    </w:p>
+    <w:p>
+      <w:pPr>
+        <w:pStyle w:val="Guidebullet"/>
+        <w:numPr>
+          <w:ilvl w:val="0"/>
+          <w:numId w:val="90"/>
+        </w:numPr>
+      </w:pPr>
+      <w:r>
+        <w:rPr/>
+        <w:t>Four whorls of modified leaves sit on the receptacle, at the end of the flower stalk (peduncle) (27.1.7).</w:t>
+      </w:r>
+    </w:p>
+    <w:p>
+      <w:pPr>
+        <w:pStyle w:val="Guidebullet"/>
+        <w:numPr>
+          <w:ilvl w:val="0"/>
+          <w:numId w:val="90"/>
+        </w:numPr>
+      </w:pPr>
+      <w:r>
+        <w:rPr/>
+        <w:t>Sepals protect the bud; petals attract pollinators (27.1.7).</w:t>
+      </w:r>
+    </w:p>
+    <w:p>
+      <w:pPr>
+        <w:pStyle w:val="Guidebullet"/>
+        <w:numPr>
+          <w:ilvl w:val="0"/>
+          <w:numId w:val="90"/>
+        </w:numPr>
+      </w:pPr>
+      <w:r>
+        <w:rPr/>
+        <w:t>Stamen (male): the anther, a saclike container where pollen forms, on a slender filament (27.1.7).</w:t>
+      </w:r>
+    </w:p>
+    <w:p>
+      <w:pPr>
+        <w:pStyle w:val="Guidebullet"/>
+        <w:numPr>
+          <w:ilvl w:val="0"/>
+          <w:numId w:val="90"/>
+        </w:numPr>
+      </w:pPr>
+      <w:r>
+        <w:rPr/>
+        <w:t>Carpel (female): the stigma, an enlarged sticky knob; the style, a slender stalk; and the ovary, the enlarged base enclosing the ovules, which produce the megaspores (27.1.7).</w:t>
+      </w:r>
+    </w:p>
+    <w:p>
+      <w:pPr>
+        <w:pStyle w:val="Guidesubheading"/>
+      </w:pPr>
+      <w:r>
+        <w:rPr/>
+        <w:t>Flower and plant types (27.1.10, 27.1.11)</w:t>
+      </w:r>
+    </w:p>
+    <w:p>
+      <w:pPr>
+        <w:pStyle w:val="Guidebullet"/>
+        <w:numPr>
+          <w:ilvl w:val="0"/>
+          <w:numId w:val="90"/>
+        </w:numPr>
+      </w:pPr>
+      <w:r>
+        <w:rPr/>
+        <w:t>Complete flowers have sepals, petals, stamens and a carpel; incomplete flowers are missing one or more (27.1.10).</w:t>
+      </w:r>
+    </w:p>
+    <w:p>
+      <w:pPr>
+        <w:pStyle w:val="Guidebullet"/>
+        <w:numPr>
+          <w:ilvl w:val="0"/>
+          <w:numId w:val="90"/>
+        </w:numPr>
+      </w:pPr>
+      <w:r>
+        <w:rPr/>
+        <w:t>Perfect (bisexual) flowers have both stamens and carpels; imperfect (unisexual) flowers have one but not the other (27.1.10).</w:t>
+      </w:r>
+    </w:p>
+    <w:p>
+      <w:pPr>
+        <w:pStyle w:val="Guidebullet"/>
+        <w:numPr>
+          <w:ilvl w:val="0"/>
+          <w:numId w:val="90"/>
+        </w:numPr>
+      </w:pPr>
+      <w:r>
+        <w:rPr/>
+        <w:t>Monoecious plants have staminate (male) and carpellate (female) flowers on the same plant (Jatropha); dioecious plants have them on separate plants, so only female holly trees bear berries (27.1.10, 27.1.11).</w:t>
+      </w:r>
+    </w:p>
+    <w:p>
+      <w:pPr>
+        <w:pStyle w:val="Guidetext"/>
+      </w:pPr>
+      <w:r>
+        <w:rPr/>
+        <w:t>Male gametophyte (27.1.12, 27.1.13): each anther has four pollen sacs full of microspore mother cells. Each mother cell undergoes meiosis to make four haploid microspores, and each microspore undergoes mitosis to make a pollen grain. At first it is an immature gametophyte of two cells: a tube cell, which will produce the pollen tube, and a generative cell, which divides by mitosis into two sperm. Then the pollen grain is the mature male gametophyte.</w:t>
+      </w:r>
+    </w:p>
+    <w:p>
+      <w:pPr>
+        <w:pStyle w:val="Guidetext"/>
+      </w:pPr>
+      <w:r>
+        <w:rPr/>
+        <w:t>Female gametophyte (27.1.13, 27.1.14): an ovule is a central mass of parenchyma cells covered by integuments. One cell enlarges into a megaspore mother cell, which undergoes meiosis to make four haploid megaspores, three of them nonfunctional. The functional megaspore divides by mitosis until there are eight nuclei. The embryo sac then has one egg cell with two synergid cells beside it, a central cell with two polar nuclei, and three antipodal cells (seven cells, eight nuclei; textbook).</w:t>
+      </w:r>
+    </w:p>
+    <w:p>
+      <w:pPr>
+        <w:pStyle w:val="Guidetext"/>
+      </w:pPr>
+      <w:r>
+        <w:rPr/>
+        <w:t>Pollination is the transfer of pollen from an anther to the stigma of a carpel: self-pollination if the pollen comes from the same plant, cross-pollination if it comes from a different plant of the same species (27.1.15). Wind-pollinated plants such as grasses release huge amounts of pollen (27.1.16; textbook).</w:t>
+      </w:r>
+    </w:p>
+    <w:p>
+      <w:pPr>
+        <w:pStyle w:val="Guidetext"/>
+      </w:pPr>
+      <w:r>
+        <w:rPr/>
+        <w:t>Fertilization comes after pollination (27.1.17): the pollen grain germinates on the stigma, and its pollen tube passes between the stigma and style to the ovule's micropyle (a small opening). Double fertilization follows: one sperm unites with the egg to make the 2n zygote, and the other unites with the two polar nuclei to make the 3n endosperm nucleus, which develops into the endosperm, the embryo's food. A mature seed contains the embryo, stored food and the seed coat (27.1.17).</w:t>
+      </w:r>
+    </w:p>
+    <w:p>
+      <w:pPr>
+        <w:pStyle w:val="Guidetext"/>
+      </w:pPr>
+      <w:r>
+        <w:rPr/>
+        <w:t>Pollinators (27.1.18, 27.1.19; textbook): bees favor yellow, blue or white flowers (bees can't see red) with ultraviolet nectar guides; butterflies favor flowers with a landing platform, such as composite flowers; hummingbirds favor red, slender-tubed flowers curved back, with lots of nectar and little smell; bats favor large, sturdy, pale flowers that open at night and smell musky. Plants and their pollinators coevolved, each adapting to the other (textbook).</w:t>
+      </w:r>
+    </w:p>
+    <w:p>
+      <w:pPr>
+        <w:pStyle w:val="Guidetext"/>
+      </w:pPr>
+      <w:r>
+        <w:rPr/>
+        <w:t>Traps: pollination (pollen reaches the stigma) vs fertilization (sperm meets egg); microspore vs megaspore; tube cell vs generative cell; synergids (beside the egg) vs antipodals vs polar nuclei; complete vs perfect; monoecious vs dioecious; zygote (2n) vs endosperm (3n) (27.1.10, 27.1.12, 27.1.14, 27.1.15, 27.1.17).</w:t>
+      </w:r>
+    </w:p>
+    <w:p>
+      <w:pPr>
+        <w:pStyle w:val="Guidepart"/>
+      </w:pPr>
+      <w:bookmarkStart w:id="27" w:name="g272"/>
+      <w:r>
+        <w:rPr>
+          <w:rStyle w:val="Slidecode"/>
+        </w:rPr>
+        <w:t>27.2 Seed Development</w:t>
+      </w:r>
+      <w:r>
+        <w:rPr/>
+        <w:t xml:space="preserve"> (slides 20–26)</w:t>
+      </w:r>
+      <w:bookmarkEnd w:id="27"/>
+    </w:p>
+    <w:p>
+      <w:pPr>
+        <w:pStyle w:val="Guidetext"/>
+      </w:pPr>
+      <w:r>
+        <w:rPr/>
+        <w:t>Development is a programmed series of stages from a simple to a more complex form, and cells differentiate (specialize) as it proceeds (27.2.20).</w:t>
+      </w:r>
+    </w:p>
+    <w:p>
+      <w:pPr>
+        <w:pStyle w:val="Guidesubheading"/>
+      </w:pPr>
+      <w:r>
+        <w:rPr/>
+        <w:t>Stages of a eudicot embryo (27.2.20 to 27.2.24)</w:t>
+      </w:r>
+    </w:p>
+    <w:p>
+      <w:pPr>
+        <w:pStyle w:val="Guidebullet"/>
+        <w:numPr>
+          <w:ilvl w:val="0"/>
+          <w:numId w:val="90"/>
+        </w:numPr>
+      </w:pPr>
+      <w:r>
+        <w:rPr/>
+        <w:t>Zygote: right after double fertilization, the zygote and the endosperm appear (27.2.23).</w:t>
+      </w:r>
+    </w:p>
+    <w:p>
+      <w:pPr>
+        <w:pStyle w:val="Guidebullet"/>
+        <w:numPr>
+          <w:ilvl w:val="0"/>
+          <w:numId w:val="90"/>
+        </w:numPr>
+      </w:pPr>
+      <w:r>
+        <w:rPr/>
+        <w:t>Proembryo: the zygote divides repeatedly into a proembryo and a suspensor, a stalk that anchors the embryo; the root-shoot axis is already set (27.2.20, 27.2.23).</w:t>
+      </w:r>
+    </w:p>
+    <w:p>
+      <w:pPr>
+        <w:pStyle w:val="Guidebullet"/>
+        <w:numPr>
+          <w:ilvl w:val="0"/>
+          <w:numId w:val="90"/>
+        </w:numPr>
+      </w:pPr>
+      <w:r>
+        <w:rPr/>
+        <w:t>Globular stage: the proembryo is a ball of cells; its outermost cells will become the dermal tissue, which protects against drying out and includes stomata (27.2.20, 27.2.24).</w:t>
+      </w:r>
+    </w:p>
+    <w:p>
+      <w:pPr>
+        <w:pStyle w:val="Guidebullet"/>
+        <w:numPr>
+          <w:ilvl w:val="0"/>
+          <w:numId w:val="90"/>
+        </w:numPr>
+      </w:pPr>
+      <w:r>
+        <w:rPr/>
+        <w:t>Heart stage: the embryo becomes heart-shaped as the cotyledons (seed leaves) appear (27.2.21, 27.2.24).</w:t>
+      </w:r>
+    </w:p>
+    <w:p>
+      <w:pPr>
+        <w:pStyle w:val="Guidebullet"/>
+        <w:numPr>
+          <w:ilvl w:val="0"/>
+          <w:numId w:val="90"/>
+        </w:numPr>
+      </w:pPr>
+      <w:r>
+        <w:rPr/>
+        <w:t>Torpedo stage: the embryo enlarges and elongates; the shoot apical meristem (for aboveground growth) and root apical meristem (for underground growth) are present (27.2.21, 27.2.24).</w:t>
+      </w:r>
+    </w:p>
+    <w:p>
+      <w:pPr>
+        <w:pStyle w:val="Guidebullet"/>
+        <w:numPr>
+          <w:ilvl w:val="0"/>
+          <w:numId w:val="90"/>
+        </w:numPr>
+      </w:pPr>
+      <w:r>
+        <w:rPr/>
+        <w:t>Mature embryo: the epicotyl, above the cotyledons, develops into the shoot; the hypocotyl, below them, contributes to the stem and ends in the radicle, the embryonic root (27.2.22). The figure's description calls the hypocotyl the root axis (27.2.24); the slide's wording is the safer one.</w:t>
+      </w:r>
+    </w:p>
+    <w:p>
+      <w:pPr>
+        <w:pStyle w:val="Guidetext"/>
+      </w:pPr>
+      <w:r>
+        <w:rPr/>
+        <w:t>As the embryo develops, the ovule's integuments become the seed coat, which protects the embryo and its food (textbook).</w:t>
+      </w:r>
+    </w:p>
+    <w:p>
+      <w:pPr>
+        <w:pStyle w:val="Guidetext"/>
+      </w:pPr>
+      <w:r>
+        <w:rPr/>
+        <w:t>Monocot vs eudicot seeds (27.2.25, 27.2.26): a monocot has one cotyledon, which stores some nutrients, absorbs others from the endosperm and passes them to the embryo, so a corn kernel still has endosperm when mature. Eudicot cotyledons store all the nutrients the embryo needs, because they have taken up the endosperm, as in a bean seed (27.2.25). In corn, the coleoptile is a sheath protecting the shoot, and the coleorhiza a sheath protecting the root (27.2.26; textbook).</w:t>
+      </w:r>
+    </w:p>
+    <w:p>
+      <w:pPr>
+        <w:pStyle w:val="Guidetext"/>
+      </w:pPr>
+      <w:r>
+        <w:rPr/>
+        <w:t>Traps: epicotyl (shoot) vs hypocotyl (stem, below the cotyledons) vs radicle (root); suspensor (anchors the embryo) vs cotyledon (seed leaf); globular, then heart, then torpedo; coleoptile (shoot sheath) vs coleorhiza (root sheath) (27.2.20, 27.2.21, 27.2.22, 27.2.26).</w:t>
+      </w:r>
+    </w:p>
+    <w:p>
+      <w:pPr>
+        <w:pStyle w:val="Guidepart"/>
+      </w:pPr>
+      <w:bookmarkStart w:id="28" w:name="g273"/>
+      <w:r>
+        <w:rPr>
+          <w:rStyle w:val="Slidecode"/>
+        </w:rPr>
+        <w:t>27.3 Fruit Types and Seed Dispersal</w:t>
+      </w:r>
+      <w:r>
+        <w:rPr/>
+        <w:t xml:space="preserve"> (slides 27–35)</w:t>
+      </w:r>
+      <w:bookmarkEnd w:id="28"/>
+    </w:p>
+    <w:p>
+      <w:pPr>
+        <w:pStyle w:val="Guidetext"/>
+      </w:pPr>
+      <w:r>
+        <w:rPr/>
+        <w:t>A fruit is a mature ovary (27.3.27); fruits protect seeds and help disperse them (textbook). Simple fruits come from a single ovary, with one or several chambers. Compound fruits come from several ovaries: aggregate fruits from the ovaries of a single flower on one receptacle (blackberry), and multiple fruits from the ovaries of separate flowers clustered together (pineapple) (27.3.27).</w:t>
+      </w:r>
+    </w:p>
+    <w:p>
+      <w:pPr>
+        <w:pStyle w:val="Guidetext"/>
+      </w:pPr>
+      <w:r>
+        <w:rPr/>
+        <w:t>As the fruit develops, the ovary wall thickens into the pericarp, which can have three layers: the exocarp (the outermost skin), the mesocarp (the flesh) and the endocarp (the boundary around the seeds, like a peach pit) (27.3.28).</w:t>
+      </w:r>
+    </w:p>
+    <w:p>
+      <w:pPr>
+        <w:pStyle w:val="Guidetext"/>
+      </w:pPr>
+      <w:r>
+        <w:rPr/>
+        <w:t>In dry fruits the pericarp is papery, leathery or woody at maturity. Dehiscent fruits split open when ripe (legumes, such as pea pods); indehiscent fruits don't (grains) (27.3.29).</w:t>
+      </w:r>
+    </w:p>
+    <w:p>
+      <w:pPr>
+        <w:pStyle w:val="Guidesubheading"/>
+      </w:pPr>
+      <w:r>
+        <w:rPr/>
+        <w:t>Named fruit types (27.3.30; examples from the textbook)</w:t>
+      </w:r>
+    </w:p>
+    <w:p>
+      <w:pPr>
+        <w:pStyle w:val="Guidebullet"/>
+        <w:numPr>
+          <w:ilvl w:val="0"/>
+          <w:numId w:val="90"/>
+        </w:numPr>
+      </w:pPr>
+      <w:r>
+        <w:rPr/>
+        <w:t>Drupe: fleshy, with a pit containing a single seed, from a simple ovary (peach) (27.3.30).</w:t>
+      </w:r>
+    </w:p>
+    <w:p>
+      <w:pPr>
+        <w:pStyle w:val="Guidebullet"/>
+        <w:numPr>
+          <w:ilvl w:val="0"/>
+          <w:numId w:val="90"/>
+        </w:numPr>
+      </w:pPr>
+      <w:r>
+        <w:rPr/>
+        <w:t>Berry: fleshy, with seeds and pulp, from a compound ovary (tomato) (27.3.30).</w:t>
+      </w:r>
+    </w:p>
+    <w:p>
+      <w:pPr>
+        <w:pStyle w:val="Guidebullet"/>
+        <w:numPr>
+          <w:ilvl w:val="0"/>
+          <w:numId w:val="90"/>
+        </w:numPr>
+      </w:pPr>
+      <w:r>
+        <w:rPr/>
+        <w:t>Legume: dry and dehiscent, from a single ovary (pea) (27.3.30).</w:t>
+      </w:r>
+    </w:p>
+    <w:p>
+      <w:pPr>
+        <w:pStyle w:val="Guidebullet"/>
+        <w:numPr>
+          <w:ilvl w:val="0"/>
+          <w:numId w:val="90"/>
+        </w:numPr>
+      </w:pPr>
+      <w:r>
+        <w:rPr/>
+        <w:t>Samara: dry and indehiscent, winged, from a simple ovary (maple) (27.3.30).</w:t>
+      </w:r>
+    </w:p>
+    <w:p>
+      <w:pPr>
+        <w:pStyle w:val="Guidetext"/>
+      </w:pPr>
+      <w:r>
+        <w:rPr/>
+        <w:t>Dispersal (27.3.31, 27.3.32): many dry fruits are carried by wind on woolly hairs, plumes or wings (dandelion); fleshy fruits feed animals (peaches, cherries, tomatoes), which carry the seeds away; hooks and spines attach dry fruits to animal fur and clothing (burdock); and dehiscent fruits disperse their seeds by forced ejection.</w:t>
+      </w:r>
+    </w:p>
+    <w:p>
+      <w:pPr>
+        <w:pStyle w:val="Guidetext"/>
+      </w:pPr>
+      <w:r>
+        <w:rPr/>
+        <w:t>Germination is when the embryo resumes growth and metabolic activity (27.3.33). Some seeds first need a dormant period with no growth: in temperate zones cold weather breaks dormancy, and fleshy fruits contain inhibitors so seeds don't germinate while still on the plant (27.3.33). A seed needs oxygen (for metabolism), warmth (for enzyme activity) and water (to hydrate its cells) (27.3.34).</w:t>
+      </w:r>
+    </w:p>
+    <w:p>
+      <w:pPr>
+        <w:pStyle w:val="Guidetext"/>
+      </w:pPr>
+      <w:r>
+        <w:rPr/>
+        <w:t>Bean vs corn germination (27.3.35; textbook): in a bean (eudicot) the root emerges first, the shoot is hook-shaped to protect the young leaves as it pushes up through the soil, and the two cotyledons feed the seedling until its leaves photosynthesize, then wither. In corn (monocot) the coleoptile covers the first leaf and the coleorhiza covers the first root as they emerge; later come adventitious and prop roots.</w:t>
+      </w:r>
+    </w:p>
+    <w:p>
+      <w:pPr>
+        <w:pStyle w:val="Guidetext"/>
+      </w:pPr>
+      <w:r>
+        <w:rPr/>
+        <w:t>Traps: simple vs aggregate vs multiple fruit; dehiscent vs indehiscent; exocarp vs mesocarp vs endocarp; drupe vs berry; dormancy vs germination (27.3.27, 27.3.28, 27.3.29, 27.3.30, 27.3.33).</w:t>
+      </w:r>
+    </w:p>
+    <w:p>
+      <w:pPr>
+        <w:pStyle w:val="Guidepart"/>
+      </w:pPr>
+      <w:bookmarkStart w:id="29" w:name="g274"/>
+      <w:r>
+        <w:rPr>
+          <w:rStyle w:val="Slidecode"/>
+        </w:rPr>
+        <w:t>27.4 Asexual Reproductive Strategies</w:t>
+      </w:r>
+      <w:r>
+        <w:rPr/>
+        <w:t xml:space="preserve"> (slides 36–41)</w:t>
+      </w:r>
+      <w:bookmarkEnd w:id="29"/>
+    </w:p>
+    <w:p>
+      <w:pPr>
+        <w:pStyle w:val="Guidetext"/>
+      </w:pPr>
+      <w:r>
+        <w:rPr/>
+        <w:t>Asexual reproduction makes clones, offspring genetically identical to their single parent (textbook). Plants do it with stolons, horizontal stems that run above ground (strawberry), and rhizomes, underground stems that produce new plants. New plants arise at the nodes of stolons and rhizomes, where new growth can occur; the "eyes" of a white potato are buds that can produce a new plant if planted with a portion of the tuber (27.4.36, 27.4.37).</w:t>
+      </w:r>
+    </w:p>
+    <w:p>
+      <w:pPr>
+        <w:pStyle w:val="Guidetext"/>
+      </w:pPr>
+      <w:r>
+        <w:rPr/>
+        <w:t>Tissue culture is the growth of a plant tissue in an artificial liquid or solid medium. It works because many plant cells are totipotent: each has the genetic capability of becoming an entire plant (27.4.38).</w:t>
+      </w:r>
+    </w:p>
+    <w:p>
+      <w:pPr>
+        <w:pStyle w:val="Guidetext"/>
+      </w:pPr>
+      <w:r>
+        <w:rPr/>
+        <w:t>Steps (27.4.39, 27.4.40): meristem tissue is placed on a medium containing auxin, cytokinins and nutrients; an undifferentiated mass of cells, the callus, forms first; organogenesis (organ formation) then starts roots and shoots; finally a plantlet forms. The plantlets are clones with identical traits, and rare plants such as the ladyslipper orchid are grown this way for conservation (27.4.40, 27.4.41).</w:t>
+      </w:r>
+    </w:p>
+    <w:p>
+      <w:pPr>
+        <w:pStyle w:val="Guidetext"/>
+      </w:pPr>
+      <w:r>
+        <w:rPr/>
+        <w:t>Cell suspension culture (27.4.40): rapidly growing calluses are cut into small pieces and shaken into a liquid nutrient medium, where single cells or small clumps form a suspension. Chemicals can be extracted from these cells, such as heart-disease drugs from Digitalis, which avoids overcollecting wild plants.</w:t>
+      </w:r>
+    </w:p>
+    <w:p>
+      <w:pPr>
+        <w:pStyle w:val="Guidetext"/>
+      </w:pPr>
+      <w:r>
+        <w:rPr/>
+        <w:t>Traps: stolon (above ground) vs rhizome (underground) vs tuber (swollen storage part); callus (undifferentiated) vs plantlet; tissue culture (whole plants) vs cell suspension culture (chemicals) (27.4.36, 27.4.40).</w:t>
+      </w:r>
+    </w:p>
+    <w:p>
+      <w:pPr>
+        <w:pStyle w:val="Guidepart"/>
+      </w:pPr>
+      <w:bookmarkStart w:id="30" w:name="g279"/>
+      <w:r>
+        <w:rPr/>
+        <w:t>Look these up, don't memorize</w:t>
+      </w:r>
+      <w:bookmarkEnd w:id="30"/>
+    </w:p>
+    <w:p>
+      <w:pPr>
+        <w:pStyle w:val="Guidebullet"/>
+        <w:numPr>
+          <w:ilvl w:val="0"/>
+          <w:numId w:val="90"/>
+        </w:numPr>
+      </w:pPr>
+      <w:r>
+        <w:rPr/>
+        <w:t>Male vs female gametophyte, step by step: the gametophyte table.</w:t>
+      </w:r>
+    </w:p>
+    <w:p>
+      <w:pPr>
+        <w:pStyle w:val="Guidebullet"/>
+        <w:numPr>
+          <w:ilvl w:val="0"/>
+          <w:numId w:val="90"/>
+        </w:numPr>
+      </w:pPr>
+      <w:r>
+        <w:rPr/>
+        <w:t>Flower parts and flower terms: the flower tables.</w:t>
+      </w:r>
+    </w:p>
+    <w:p>
+      <w:pPr>
+        <w:pStyle w:val="Guidebullet"/>
+        <w:numPr>
+          <w:ilvl w:val="0"/>
+          <w:numId w:val="90"/>
+        </w:numPr>
+      </w:pPr>
+      <w:r>
+        <w:rPr/>
+        <w:t>Embryo stages, seed parts, fruit types and dispersal: the seed and fruit tables.</w:t>
+      </w:r>
+    </w:p>
+    <w:p>
+      <w:pPr>
+        <w:pStyle w:val="Guidebullet"/>
+        <w:numPr>
+          <w:ilvl w:val="0"/>
+          <w:numId w:val="90"/>
+        </w:numPr>
+      </w:pPr>
+      <w:r>
+        <w:rPr/>
+        <w:t>Pollinators and their flowers: the pollinator table.</w:t>
+      </w:r>
+    </w:p>
+    <w:p>
+      <w:pPr>
+        <w:pStyle w:val="Guidebullet"/>
+        <w:numPr>
+          <w:ilvl w:val="0"/>
+          <w:numId w:val="90"/>
+        </w:numPr>
+      </w:pPr>
+      <w:r>
+        <w:rPr/>
+        <w:t>Exact numbers (species counts, seed sizes): don't memorize them.</w:t>
       </w:r>
     </w:p>
     <w:sectPr>
@@ -14797,13 +15833,13 @@
     <w:name w:val="How to"/>
     <w:basedOn w:val="Normal"/>
     <w:pPr>
-      <w:spacing w:before="0" w:after="0"/>
       <w:pBdr>
         <w:top w:val="single" w:sz="4" w:space="2" w:color="auto"/>
         <w:left w:val="single" w:sz="4" w:space="2" w:color="auto"/>
         <w:bottom w:val="single" w:sz="4" w:space="2" w:color="auto"/>
         <w:right w:val="single" w:sz="4" w:space="2" w:color="auto"/>
       </w:pBdr>
+      <w:spacing w:before="0" w:after="0"/>
     </w:pPr>
     <w:rPr/>
   </w:style>
@@ -14811,14 +15847,14 @@
     <w:name w:val="How to step"/>
     <w:basedOn w:val="Normal"/>
     <w:pPr>
-      <w:spacing w:before="0" w:after="0"/>
-      <w:ind w:left="220" w:hanging="220"/>
       <w:pBdr>
         <w:top w:val="single" w:sz="4" w:space="2" w:color="auto"/>
         <w:left w:val="single" w:sz="4" w:space="2" w:color="auto"/>
         <w:bottom w:val="single" w:sz="4" w:space="2" w:color="auto"/>
         <w:right w:val="single" w:sz="4" w:space="2" w:color="auto"/>
       </w:pBdr>
+      <w:spacing w:before="0" w:after="0"/>
+      <w:ind w:left="220" w:hanging="220"/>
     </w:pPr>
     <w:rPr/>
   </w:style>
@@ -14967,12 +16003,6 @@
     <w:pPr>
       <w:keepNext/>
       <w:spacing w:before="44" w:after="33"/>
-      <w:pBdr>
-        <w:top w:val="single" w:sz="4" w:space="2" w:color="auto"/>
-        <w:left w:val="single" w:sz="4" w:space="2" w:color="auto"/>
-        <w:bottom w:val="single" w:sz="4" w:space="2" w:color="auto"/>
-        <w:right w:val="single" w:sz="4" w:space="2" w:color="auto"/>
-      </w:pBdr>
     </w:pPr>
     <w:rPr>
       <w:b/>
@@ -14985,12 +16015,6 @@
     <w:pPr>
       <w:keepNext/>
       <w:spacing w:before="88" w:after="22"/>
-      <w:pBdr>
-        <w:top w:val="single" w:sz="4" w:space="2" w:color="auto"/>
-        <w:left w:val="single" w:sz="4" w:space="2" w:color="auto"/>
-        <w:bottom w:val="single" w:sz="4" w:space="2" w:color="auto"/>
-        <w:right w:val="single" w:sz="4" w:space="2" w:color="auto"/>
-      </w:pBdr>
     </w:pPr>
     <w:rPr>
       <w:b/>
@@ -15003,12 +16027,6 @@
     <w:pPr>
       <w:keepNext/>
       <w:spacing w:before="55" w:after="0"/>
-      <w:pBdr>
-        <w:top w:val="single" w:sz="4" w:space="2" w:color="auto"/>
-        <w:left w:val="single" w:sz="4" w:space="2" w:color="auto"/>
-        <w:bottom w:val="single" w:sz="4" w:space="2" w:color="auto"/>
-        <w:right w:val="single" w:sz="4" w:space="2" w:color="auto"/>
-      </w:pBdr>
     </w:pPr>
     <w:rPr>
       <w:b/>
@@ -15019,12 +16037,6 @@
     <w:basedOn w:val="Normal"/>
     <w:pPr>
       <w:spacing w:before="0" w:after="55"/>
-      <w:pBdr>
-        <w:top w:val="single" w:sz="4" w:space="2" w:color="auto"/>
-        <w:left w:val="single" w:sz="4" w:space="2" w:color="auto"/>
-        <w:bottom w:val="single" w:sz="4" w:space="2" w:color="auto"/>
-        <w:right w:val="single" w:sz="4" w:space="2" w:color="auto"/>
-      </w:pBdr>
     </w:pPr>
     <w:rPr/>
   </w:style>
@@ -15033,12 +16045,6 @@
     <w:basedOn w:val="Normal"/>
     <w:pPr>
       <w:spacing w:before="0" w:after="0"/>
-      <w:pBdr>
-        <w:top w:val="single" w:sz="4" w:space="2" w:color="auto"/>
-        <w:left w:val="single" w:sz="4" w:space="2" w:color="auto"/>
-        <w:bottom w:val="single" w:sz="4" w:space="2" w:color="auto"/>
-        <w:right w:val="single" w:sz="4" w:space="2" w:color="auto"/>
-      </w:pBdr>
     </w:pPr>
     <w:rPr/>
   </w:style>

</xml_diff>